<commit_message>
Support paywalled papers: save abstract now, attach PDF later
- add <PDF> matches an existing entry by DOI/arXiv, then by title,
  and keeps the existing bibliographic data, filling only gaps
- add <PDF> --key <citekey> attaches a PDF whose title can't be read
- list shows PDF-waiting entries; list --pending filters them
- clearer note when no open-access PDF is available
- docs (SKILL, README, usage guide in 4 formats) describe the flow

Co-Authored-By: Claude Opus 5.5 <noreply@anthropic.com>
</commit_message>
<xml_diff>
--- a/docs/paper-summary_사용가이드.docx
+++ b/docs/paper-summary_사용가이드.docx
@@ -917,18 +917,6 @@
           <w:rFonts w:ascii="맑은 고딕" w:hAnsi="맑은 고딕" w:eastAsia="맑은 고딕"/>
           <w:b w:val="0"/>
         </w:rPr>
-        <w:t>유료 논문은 공개 PDF가 없으면 서지 정보만 등록됩니다. 직접 받은 PDF의 경로를 주면 본문과 그림을 추출합니다.</w:t>
-      </w:r>
-    </w:p>
-    <w:p>
-      <w:pPr>
-        <w:pStyle w:val="ListBullet"/>
-      </w:pPr>
-      <w:r>
-        <w:rPr>
-          <w:rFonts w:ascii="맑은 고딕" w:hAnsi="맑은 고딕" w:eastAsia="맑은 고딕"/>
-          <w:b w:val="0"/>
-        </w:rPr>
         <w:t xml:space="preserve">디스크가 부족하면 "PDF는 지워줘"라고 하세요. </w:t>
       </w:r>
       <w:r>
@@ -945,6 +933,157 @@
           <w:b w:val="0"/>
         </w:rPr>
         <w:t xml:space="preserve"> 옵션으로 추출만 하고 PDF는 남기지 않습니다.</w:t>
+      </w:r>
+    </w:p>
+    <w:p>
+      <w:pPr>
+        <w:pStyle w:val="Heading3"/>
+      </w:pPr>
+      <w:r>
+        <w:t>유료 논문 (초록만 있는 경우)</w:t>
+      </w:r>
+    </w:p>
+    <w:p>
+      <w:pPr>
+        <w:ind w:left="357" w:hanging="357"/>
+      </w:pPr>
+      <w:r>
+        <w:rPr>
+          <w:rFonts w:ascii="맑은 고딕" w:hAnsi="맑은 고딕" w:eastAsia="맑은 고딕"/>
+          <w:b/>
+          <w:color w:val="0B5C5A"/>
+        </w:rPr>
+        <w:t>1.</w:t>
+        <w:tab/>
+      </w:r>
+      <w:r>
+        <w:rPr>
+          <w:rFonts w:ascii="맑은 고딕" w:hAnsi="맑은 고딕" w:eastAsia="맑은 고딕"/>
+          <w:b w:val="0"/>
+        </w:rPr>
+        <w:t xml:space="preserve">DOI로 추가하면 서지와 초록만 저장되고, 목록에 </w:t>
+      </w:r>
+      <w:r>
+        <w:rPr>
+          <w:rFonts w:ascii="Consolas" w:hAnsi="Consolas" w:eastAsia="맑은 고딕"/>
+          <w:color w:val="8A2B2B"/>
+          <w:sz w:val="19"/>
+        </w:rPr>
+        <w:t>PDF대기</w:t>
+      </w:r>
+      <w:r>
+        <w:rPr>
+          <w:rFonts w:ascii="맑은 고딕" w:hAnsi="맑은 고딕" w:eastAsia="맑은 고딕"/>
+          <w:b w:val="0"/>
+        </w:rPr>
+        <w:t>로 표시됩니다. 요약은 초록 기준의 임시 요약입니다.</w:t>
+      </w:r>
+    </w:p>
+    <w:p>
+      <w:pPr>
+        <w:ind w:left="357" w:hanging="357"/>
+      </w:pPr>
+      <w:r>
+        <w:rPr>
+          <w:rFonts w:ascii="맑은 고딕" w:hAnsi="맑은 고딕" w:eastAsia="맑은 고딕"/>
+          <w:b/>
+          <w:color w:val="0B5C5A"/>
+        </w:rPr>
+        <w:t>2.</w:t>
+        <w:tab/>
+      </w:r>
+      <w:r>
+        <w:rPr>
+          <w:rFonts w:ascii="맑은 고딕" w:hAnsi="맑은 고딕" w:eastAsia="맑은 고딕"/>
+          <w:b w:val="0"/>
+        </w:rPr>
+        <w:t xml:space="preserve">도서관이나 출판사에서 PDF를 받은 뒤 </w:t>
+      </w:r>
+      <w:r>
+        <w:rPr>
+          <w:rFonts w:ascii="Consolas" w:hAnsi="Consolas" w:eastAsia="맑은 고딕"/>
+          <w:color w:val="8A2B2B"/>
+          <w:sz w:val="19"/>
+        </w:rPr>
+        <w:t>이 PDF로 정리해줘: C:\Downloads\paper.pdf</w:t>
+      </w:r>
+      <w:r>
+        <w:rPr>
+          <w:rFonts w:ascii="맑은 고딕" w:hAnsi="맑은 고딕" w:eastAsia="맑은 고딕"/>
+          <w:b w:val="0"/>
+        </w:rPr>
+        <w:t>라고 말합니다.</w:t>
+      </w:r>
+    </w:p>
+    <w:p>
+      <w:pPr>
+        <w:ind w:left="357" w:hanging="357"/>
+      </w:pPr>
+      <w:r>
+        <w:rPr>
+          <w:rFonts w:ascii="맑은 고딕" w:hAnsi="맑은 고딕" w:eastAsia="맑은 고딕"/>
+          <w:b/>
+          <w:color w:val="0B5C5A"/>
+        </w:rPr>
+        <w:t>3.</w:t>
+        <w:tab/>
+      </w:r>
+      <w:r>
+        <w:rPr>
+          <w:rFonts w:ascii="맑은 고딕" w:hAnsi="맑은 고딕" w:eastAsia="맑은 고딕"/>
+          <w:b w:val="0"/>
+        </w:rPr>
+        <w:t>Claude가 PDF의 DOI나 제목으로 같은 항목을 찾아 본문과 그림을 채우고, 요약을 본문 기준(쪽 번호 인용 포함)으로 다시 씁니다. 기존 서지 정보는 그대로 유지됩니다.</w:t>
+      </w:r>
+    </w:p>
+    <w:p>
+      <w:pPr>
+        <w:ind w:left="357" w:hanging="357"/>
+      </w:pPr>
+      <w:r>
+        <w:rPr>
+          <w:rFonts w:ascii="맑은 고딕" w:hAnsi="맑은 고딕" w:eastAsia="맑은 고딕"/>
+          <w:b/>
+          <w:color w:val="0B5C5A"/>
+        </w:rPr>
+        <w:t>4.</w:t>
+        <w:tab/>
+      </w:r>
+      <w:r>
+        <w:rPr>
+          <w:rFonts w:ascii="맑은 고딕" w:hAnsi="맑은 고딕" w:eastAsia="맑은 고딕"/>
+          <w:b w:val="0"/>
+        </w:rPr>
+        <w:t xml:space="preserve">스캔본처럼 제목을 읽을 수 없는 PDF는 citekey를 함께 알려 주세요. 예: </w:t>
+      </w:r>
+      <w:r>
+        <w:rPr>
+          <w:rFonts w:ascii="Consolas" w:hAnsi="Consolas" w:eastAsia="맑은 고딕"/>
+          <w:color w:val="8A2B2B"/>
+          <w:sz w:val="19"/>
+        </w:rPr>
+        <w:t>이 PDF를 Mohamad2026physqual에 붙여줘</w:t>
+      </w:r>
+    </w:p>
+    <w:p>
+      <w:pPr>
+        <w:ind w:left="357" w:hanging="357"/>
+      </w:pPr>
+      <w:r>
+        <w:rPr>
+          <w:rFonts w:ascii="맑은 고딕" w:hAnsi="맑은 고딕" w:eastAsia="맑은 고딕"/>
+          <w:b/>
+          <w:color w:val="0B5C5A"/>
+        </w:rPr>
+        <w:t>5.</w:t>
+        <w:tab/>
+      </w:r>
+      <w:r>
+        <w:rPr>
+          <w:rFonts w:ascii="맑은 고딕" w:hAnsi="맑은 고딕" w:eastAsia="맑은 고딕"/>
+          <w:b w:val="0"/>
+        </w:rPr>
+        <w:t>PDF를 기다리는 논문은 "PDF 대기 목록 보여줘"로 모아 볼 수 있습니다.</w:t>
       </w:r>
     </w:p>
     <w:p>
@@ -1513,7 +1652,7 @@
                 <w:color w:val="8A2B2B"/>
                 <w:sz w:val="17"/>
               </w:rPr>
-              <w:t>paperlib.py list</w:t>
+              <w:t>paperlib.py add &lt;PDF 경로&gt; [--key &lt;citekey&gt;]</w:t>
             </w:r>
           </w:p>
         </w:tc>
@@ -1532,7 +1671,7 @@
                 <w:b w:val="0"/>
                 <w:sz w:val="19"/>
               </w:rPr>
-              <w:t>라이브러리 목록</w:t>
+              <w:t>유료 논문에 나중에 받은 PDF 붙이기</w:t>
             </w:r>
           </w:p>
         </w:tc>
@@ -1552,6 +1691,61 @@
                 <w:color w:val="8A2B2B"/>
                 <w:sz w:val="17"/>
               </w:rPr>
+              <w:t>paperlib.py list [--pending]</w:t>
+            </w:r>
+          </w:p>
+        </w:tc>
+        <w:tc>
+          <w:tcPr>
+            <w:tcW w:type="dxa" w:w="4706"/>
+          </w:tcPr>
+          <w:p>
+            <w:pPr>
+              <w:spacing w:after="0"/>
+            </w:pPr>
+            <w:r>
+              <w:rPr>
+                <w:rFonts w:ascii="맑은 고딕" w:hAnsi="맑은 고딕" w:eastAsia="맑은 고딕"/>
+                <w:b w:val="0"/>
+                <w:sz w:val="19"/>
+              </w:rPr>
+              <w:t>라이브러리 목록 (</w:t>
+            </w:r>
+            <w:r>
+              <w:rPr>
+                <w:rFonts w:ascii="Consolas" w:hAnsi="Consolas" w:eastAsia="맑은 고딕"/>
+                <w:color w:val="8A2B2B"/>
+                <w:sz w:val="17"/>
+              </w:rPr>
+              <w:t>--pending</w:t>
+            </w:r>
+            <w:r>
+              <w:rPr>
+                <w:rFonts w:ascii="맑은 고딕" w:hAnsi="맑은 고딕" w:eastAsia="맑은 고딕"/>
+                <w:b w:val="0"/>
+                <w:sz w:val="19"/>
+              </w:rPr>
+              <w:t>: PDF 대기만)</w:t>
+            </w:r>
+          </w:p>
+        </w:tc>
+      </w:tr>
+      <w:tr>
+        <w:tc>
+          <w:tcPr>
+            <w:tcW w:type="dxa" w:w="4706"/>
+            <w:shd w:val="clear" w:color="auto" w:fill="EEF5F4"/>
+          </w:tcPr>
+          <w:p>
+            <w:pPr>
+              <w:spacing w:after="0"/>
+            </w:pPr>
+            <w:r>
+              <w:rPr>
+                <w:rFonts w:ascii="Consolas" w:hAnsi="Consolas" w:eastAsia="맑은 고딕"/>
+                <w:color w:val="8A2B2B"/>
+                <w:sz w:val="17"/>
+              </w:rPr>
               <w:t>paperlib.py search &lt;단어...&gt;</w:t>
             </w:r>
           </w:p>
@@ -1559,6 +1753,7 @@
         <w:tc>
           <w:tcPr>
             <w:tcW w:type="dxa" w:w="4706"/>
+            <w:shd w:val="clear" w:color="auto" w:fill="EEF5F4"/>
           </w:tcPr>
           <w:p>
             <w:pPr>
@@ -1579,7 +1774,6 @@
         <w:tc>
           <w:tcPr>
             <w:tcW w:type="dxa" w:w="4706"/>
-            <w:shd w:val="clear" w:color="auto" w:fill="EEF5F4"/>
           </w:tcPr>
           <w:p>
             <w:pPr>
@@ -1598,7 +1792,6 @@
         <w:tc>
           <w:tcPr>
             <w:tcW w:type="dxa" w:w="4706"/>
-            <w:shd w:val="clear" w:color="auto" w:fill="EEF5F4"/>
           </w:tcPr>
           <w:p>
             <w:pPr>
@@ -1619,6 +1812,7 @@
         <w:tc>
           <w:tcPr>
             <w:tcW w:type="dxa" w:w="4706"/>
+            <w:shd w:val="clear" w:color="auto" w:fill="EEF5F4"/>
           </w:tcPr>
           <w:p>
             <w:pPr>
@@ -1637,6 +1831,7 @@
         <w:tc>
           <w:tcPr>
             <w:tcW w:type="dxa" w:w="4706"/>
+            <w:shd w:val="clear" w:color="auto" w:fill="EEF5F4"/>
           </w:tcPr>
           <w:p>
             <w:pPr>
@@ -1657,7 +1852,6 @@
         <w:tc>
           <w:tcPr>
             <w:tcW w:type="dxa" w:w="4706"/>
-            <w:shd w:val="clear" w:color="auto" w:fill="EEF5F4"/>
           </w:tcPr>
           <w:p>
             <w:pPr>
@@ -1676,7 +1870,6 @@
         <w:tc>
           <w:tcPr>
             <w:tcW w:type="dxa" w:w="4706"/>
-            <w:shd w:val="clear" w:color="auto" w:fill="EEF5F4"/>
           </w:tcPr>
           <w:p>
             <w:pPr>
@@ -1697,6 +1890,7 @@
         <w:tc>
           <w:tcPr>
             <w:tcW w:type="dxa" w:w="4706"/>
+            <w:shd w:val="clear" w:color="auto" w:fill="EEF5F4"/>
           </w:tcPr>
           <w:p>
             <w:pPr>
@@ -1715,6 +1909,7 @@
         <w:tc>
           <w:tcPr>
             <w:tcW w:type="dxa" w:w="4706"/>
+            <w:shd w:val="clear" w:color="auto" w:fill="EEF5F4"/>
           </w:tcPr>
           <w:p>
             <w:pPr>

</xml_diff>

<commit_message>
Rewrite usage guide around natural-language prompts to Claude
- guide (md/docx/pdf/pptx) and README show what to say to Claude
  for each task; CLI commands move to an appendix
- SKILL.md handles install/update requests, finding a source for a
  sentence, summarizing unsummarized papers, and missing cite keys

Co-Authored-By: Claude Opus 5.5 <noreply@anthropic.com>
</commit_message>
<xml_diff>
--- a/docs/paper-summary_사용가이드.docx
+++ b/docs/paper-summary_사용가이드.docx
@@ -7,7 +7,7 @@
         <w:pStyle w:val="Heading1"/>
       </w:pPr>
       <w:r>
-        <w:t>paper-summary 사용 가이드</w:t>
+        <w:t>paper-summary 사용 가이드 — Claude에게 이렇게 말하세요</w:t>
       </w:r>
     </w:p>
     <w:p>
@@ -16,7 +16,7 @@
           <w:rFonts w:ascii="맑은 고딕" w:hAnsi="맑은 고딕" w:eastAsia="맑은 고딕"/>
           <w:b w:val="0"/>
         </w:rPr>
-        <w:t>Claude Code에서 논문을 찾고, 요약을 로컬 라이브러리에 쌓아 두었다가, 글을 쓸 때 인용하면 참고문헌이 자동으로 달리게 하는 스킬입니다.</w:t>
+        <w:t>Claude Code에서 자연어로 말하기만 하면, 논문을 찾고 요약해 쌓아 두었다가 글을 쓸 때 참고문헌까지 자동으로 달아 주는 스킬입니다. 명령어를 외울 필요가 없습니다.</w:t>
       </w:r>
     </w:p>
     <w:p>
@@ -40,7 +40,7 @@
           <w:rFonts w:ascii="맑은 고딕" w:hAnsi="맑은 고딕" w:eastAsia="맑은 고딕"/>
           <w:b w:val="0"/>
         </w:rPr>
-        <w:t>비용: Zotero와 LLM API 키가 필요 없습니다. 서지 정보는 무료 공개 API(Crossref, arXiv, OpenAlex)에서 가져오고, 요약은 Claude Code 대화 안에서 Claude가 직접 씁니다.</w:t>
+        <w:t>비용: Zotero와 LLM API 키가 필요 없습니다. 서지 정보는 무료 공개 API에서 가져오고, 요약은 Claude가 대화 안에서 직접 씁니다.</w:t>
       </w:r>
     </w:p>
     <w:p>
@@ -59,14 +59,13 @@
         <w:tblLook w:firstColumn="1" w:firstRow="1" w:lastColumn="0" w:lastRow="0" w:noHBand="0" w:noVBand="1" w:val="04A0"/>
       </w:tblPr>
       <w:tblGrid>
-        <w:gridCol w:w="3137"/>
-        <w:gridCol w:w="3137"/>
-        <w:gridCol w:w="3137"/>
+        <w:gridCol w:w="4706"/>
+        <w:gridCol w:w="4706"/>
       </w:tblGrid>
       <w:tr>
         <w:tc>
           <w:tcPr>
-            <w:tcW w:type="dxa" w:w="3137"/>
+            <w:tcW w:type="dxa" w:w="4706"/>
             <w:shd w:val="clear" w:color="auto" w:fill="0B5C5A"/>
           </w:tcPr>
           <w:p>
@@ -80,33 +79,13 @@
                 <w:color w:val="FFFFFF"/>
                 <w:sz w:val="19"/>
               </w:rPr>
-              <w:t>단계</w:t>
+              <w:t>하고 싶은 일</w:t>
             </w:r>
           </w:p>
         </w:tc>
         <w:tc>
           <w:tcPr>
-            <w:tcW w:type="dxa" w:w="3137"/>
-            <w:shd w:val="clear" w:color="auto" w:fill="0B5C5A"/>
-          </w:tcPr>
-          <w:p>
-            <w:pPr>
-              <w:spacing w:after="0"/>
-            </w:pPr>
-            <w:r>
-              <w:rPr>
-                <w:rFonts w:ascii="맑은 고딕" w:hAnsi="맑은 고딕" w:eastAsia="맑은 고딕"/>
-                <w:b/>
-                <w:color w:val="FFFFFF"/>
-                <w:sz w:val="19"/>
-              </w:rPr>
-              <w:t>하는 일</w:t>
-            </w:r>
-          </w:p>
-        </w:tc>
-        <w:tc>
-          <w:tcPr>
-            <w:tcW w:type="dxa" w:w="3137"/>
+            <w:tcW w:type="dxa" w:w="4706"/>
             <w:shd w:val="clear" w:color="auto" w:fill="0B5C5A"/>
           </w:tcPr>
           <w:p>
@@ -128,7 +107,7 @@
       <w:tr>
         <w:tc>
           <w:tcPr>
-            <w:tcW w:type="dxa" w:w="3137"/>
+            <w:tcW w:type="dxa" w:w="4706"/>
           </w:tcPr>
           <w:p>
             <w:pPr>
@@ -140,31 +119,13 @@
                 <w:b w:val="0"/>
                 <w:sz w:val="19"/>
               </w:rPr>
-              <w:t>① 조사</w:t>
+              <w:t>주제로 논문 조사</w:t>
             </w:r>
           </w:p>
         </w:tc>
         <w:tc>
           <w:tcPr>
-            <w:tcW w:type="dxa" w:w="3137"/>
-          </w:tcPr>
-          <w:p>
-            <w:pPr>
-              <w:spacing w:after="0"/>
-            </w:pPr>
-            <w:r>
-              <w:rPr>
-                <w:rFonts w:ascii="맑은 고딕" w:hAnsi="맑은 고딕" w:eastAsia="맑은 고딕"/>
-                <w:b w:val="0"/>
-                <w:sz w:val="19"/>
-              </w:rPr>
-              <w:t>주제로 논문 검색·선별·종합</w:t>
-            </w:r>
-          </w:p>
-        </w:tc>
-        <w:tc>
-          <w:tcPr>
-            <w:tcW w:type="dxa" w:w="3137"/>
+            <w:tcW w:type="dxa" w:w="4706"/>
           </w:tcPr>
           <w:p>
             <w:pPr>
@@ -184,7 +145,7 @@
       <w:tr>
         <w:tc>
           <w:tcPr>
-            <w:tcW w:type="dxa" w:w="3137"/>
+            <w:tcW w:type="dxa" w:w="4706"/>
             <w:shd w:val="clear" w:color="auto" w:fill="EEF5F4"/>
           </w:tcPr>
           <w:p>
@@ -197,32 +158,13 @@
                 <w:b w:val="0"/>
                 <w:sz w:val="19"/>
               </w:rPr>
-              <w:t>② 저장</w:t>
+              <w:t>논문 한 편 저장·요약</w:t>
             </w:r>
           </w:p>
         </w:tc>
         <w:tc>
           <w:tcPr>
-            <w:tcW w:type="dxa" w:w="3137"/>
-            <w:shd w:val="clear" w:color="auto" w:fill="EEF5F4"/>
-          </w:tcPr>
-          <w:p>
-            <w:pPr>
-              <w:spacing w:after="0"/>
-            </w:pPr>
-            <w:r>
-              <w:rPr>
-                <w:rFonts w:ascii="맑은 고딕" w:hAnsi="맑은 고딕" w:eastAsia="맑은 고딕"/>
-                <w:b w:val="0"/>
-                <w:sz w:val="19"/>
-              </w:rPr>
-              <w:t>논문 한 편의 서지·본문·그림 저장 + 요약 노트</w:t>
-            </w:r>
-          </w:p>
-        </w:tc>
-        <w:tc>
-          <w:tcPr>
-            <w:tcW w:type="dxa" w:w="3137"/>
+            <w:tcW w:type="dxa" w:w="4706"/>
             <w:shd w:val="clear" w:color="auto" w:fill="EEF5F4"/>
           </w:tcPr>
           <w:p>
@@ -243,7 +185,7 @@
       <w:tr>
         <w:tc>
           <w:tcPr>
-            <w:tcW w:type="dxa" w:w="3137"/>
+            <w:tcW w:type="dxa" w:w="4706"/>
           </w:tcPr>
           <w:p>
             <w:pPr>
@@ -255,13 +197,34 @@
                 <w:b w:val="0"/>
                 <w:sz w:val="19"/>
               </w:rPr>
-              <w:t>③ 집필</w:t>
+              <w:t>가진 PDF 정리</w:t>
             </w:r>
           </w:p>
         </w:tc>
         <w:tc>
           <w:tcPr>
-            <w:tcW w:type="dxa" w:w="3137"/>
+            <w:tcW w:type="dxa" w:w="4706"/>
+          </w:tcPr>
+          <w:p>
+            <w:pPr>
+              <w:spacing w:after="0"/>
+            </w:pPr>
+            <w:r>
+              <w:rPr>
+                <w:rFonts w:ascii="Consolas" w:hAnsi="Consolas" w:eastAsia="맑은 고딕"/>
+                <w:color w:val="8A2B2B"/>
+                <w:sz w:val="17"/>
+              </w:rPr>
+              <w:t>C:\Downloads\paper.pdf 논문 요약해줘</w:t>
+            </w:r>
+          </w:p>
+        </w:tc>
+      </w:tr>
+      <w:tr>
+        <w:tc>
+          <w:tcPr>
+            <w:tcW w:type="dxa" w:w="4706"/>
+            <w:shd w:val="clear" w:color="auto" w:fill="EEF5F4"/>
           </w:tcPr>
           <w:p>
             <w:pPr>
@@ -273,13 +236,14 @@
                 <w:b w:val="0"/>
                 <w:sz w:val="19"/>
               </w:rPr>
-              <w:t>라이브러리 내용으로 글을 쓰고 참고문헌 자동 생성</w:t>
+              <w:t>저장한 논문 찾기</w:t>
             </w:r>
           </w:p>
         </w:tc>
         <w:tc>
           <w:tcPr>
-            <w:tcW w:type="dxa" w:w="3137"/>
+            <w:tcW w:type="dxa" w:w="4706"/>
+            <w:shd w:val="clear" w:color="auto" w:fill="EEF5F4"/>
           </w:tcPr>
           <w:p>
             <w:pPr>
@@ -291,7 +255,85 @@
                 <w:color w:val="8A2B2B"/>
                 <w:sz w:val="17"/>
               </w:rPr>
-              <w:t>라이브러리의 HRV 논문들로 서론 써주고 참고문헌 APA로 달아줘</w:t>
+              <w:t>라이브러리에서 HRV 관련 논문 찾아줘</w:t>
+            </w:r>
+          </w:p>
+        </w:tc>
+      </w:tr>
+      <w:tr>
+        <w:tc>
+          <w:tcPr>
+            <w:tcW w:type="dxa" w:w="4706"/>
+          </w:tcPr>
+          <w:p>
+            <w:pPr>
+              <w:spacing w:after="0"/>
+            </w:pPr>
+            <w:r>
+              <w:rPr>
+                <w:rFonts w:ascii="맑은 고딕" w:hAnsi="맑은 고딕" w:eastAsia="맑은 고딕"/>
+                <w:b w:val="0"/>
+                <w:sz w:val="19"/>
+              </w:rPr>
+              <w:t>글쓰기 + 인용</w:t>
+            </w:r>
+          </w:p>
+        </w:tc>
+        <w:tc>
+          <w:tcPr>
+            <w:tcW w:type="dxa" w:w="4706"/>
+          </w:tcPr>
+          <w:p>
+            <w:pPr>
+              <w:spacing w:after="0"/>
+            </w:pPr>
+            <w:r>
+              <w:rPr>
+                <w:rFonts w:ascii="Consolas" w:hAnsi="Consolas" w:eastAsia="맑은 고딕"/>
+                <w:color w:val="8A2B2B"/>
+                <w:sz w:val="17"/>
+              </w:rPr>
+              <w:t>라이브러리의 HRV 논문들로 연구 배경 써주고 참고문헌 APA로 달아줘</w:t>
+            </w:r>
+          </w:p>
+        </w:tc>
+      </w:tr>
+      <w:tr>
+        <w:tc>
+          <w:tcPr>
+            <w:tcW w:type="dxa" w:w="4706"/>
+            <w:shd w:val="clear" w:color="auto" w:fill="EEF5F4"/>
+          </w:tcPr>
+          <w:p>
+            <w:pPr>
+              <w:spacing w:after="0"/>
+            </w:pPr>
+            <w:r>
+              <w:rPr>
+                <w:rFonts w:ascii="맑은 고딕" w:hAnsi="맑은 고딕" w:eastAsia="맑은 고딕"/>
+                <w:b w:val="0"/>
+                <w:sz w:val="19"/>
+              </w:rPr>
+              <w:t>내 원고에 참고문헌</w:t>
+            </w:r>
+          </w:p>
+        </w:tc>
+        <w:tc>
+          <w:tcPr>
+            <w:tcW w:type="dxa" w:w="4706"/>
+            <w:shd w:val="clear" w:color="auto" w:fill="EEF5F4"/>
+          </w:tcPr>
+          <w:p>
+            <w:pPr>
+              <w:spacing w:after="0"/>
+            </w:pPr>
+            <w:r>
+              <w:rPr>
+                <w:rFonts w:ascii="Consolas" w:hAnsi="Consolas" w:eastAsia="맑은 고딕"/>
+                <w:color w:val="8A2B2B"/>
+                <w:sz w:val="17"/>
+              </w:rPr>
+              <w:t>draft.md 참고문헌 IEEE로 달아줘</w:t>
             </w:r>
           </w:p>
         </w:tc>
@@ -300,10 +342,40 @@
     <w:p/>
     <w:p>
       <w:pPr>
+        <w:ind w:left="227"/>
+        <w:shd w:val="clear" w:color="auto" w:fill="EEF5F4"/>
+      </w:pPr>
+      <w:r>
+        <w:rPr>
+          <w:rFonts w:ascii="맑은 고딕" w:hAnsi="맑은 고딕" w:eastAsia="맑은 고딕"/>
+          <w:b w:val="0"/>
+          <w:sz w:val="20"/>
+        </w:rPr>
+        <w:t xml:space="preserve">팁: 처음에 </w:t>
+      </w:r>
+      <w:r>
+        <w:rPr>
+          <w:rFonts w:ascii="Consolas" w:hAnsi="Consolas" w:eastAsia="맑은 고딕"/>
+          <w:color w:val="8A2B2B"/>
+          <w:sz w:val="18"/>
+        </w:rPr>
+        <w:t>/paper-summary</w:t>
+      </w:r>
+      <w:r>
+        <w:rPr>
+          <w:rFonts w:ascii="맑은 고딕" w:hAnsi="맑은 고딕" w:eastAsia="맑은 고딕"/>
+          <w:b w:val="0"/>
+          <w:sz w:val="20"/>
+        </w:rPr>
+        <w:t>를 붙이면 이 스킬을 확실히 씁니다. 붙이지 않아도 "논문 요약", "참고문헌" 같은 말이 있으면 Claude가 알아서 이 스킬을 고릅니다.</w:t>
+      </w:r>
+    </w:p>
+    <w:p>
+      <w:pPr>
         <w:pStyle w:val="Heading2"/>
       </w:pPr>
       <w:r>
-        <w:t>2. 설치</w:t>
+        <w:t>2. 설치 (처음 한 번)</w:t>
       </w:r>
     </w:p>
     <w:p>
@@ -312,15 +384,90 @@
           <w:rFonts w:ascii="맑은 고딕" w:hAnsi="맑은 고딕" w:eastAsia="맑은 고딕"/>
           <w:b w:val="0"/>
         </w:rPr>
-        <w:t>필요한 것: Claude Code, Python 3.9 이상, git</w:t>
+        <w:t>Claude Code에 이렇게 말하면 Claude가 설치까지 해 줍니다.</w:t>
       </w:r>
     </w:p>
     <w:p>
       <w:pPr>
-        <w:pStyle w:val="Heading3"/>
+        <w:spacing w:after="160" w:line="264" w:lineRule="auto"/>
+        <w:ind w:left="170"/>
+        <w:shd w:val="clear" w:color="auto" w:fill="F2F4F5"/>
       </w:pPr>
       <w:r>
-        <w:t>Windows (PowerShell)</w:t>
+        <w:rPr>
+          <w:rFonts w:ascii="Consolas" w:hAnsi="Consolas" w:eastAsia="맑은 고딕"/>
+          <w:sz w:val="18"/>
+        </w:rPr>
+        <w:t>https://github.com/emilyJ7/paper-summary 스킬을 ~/.claude/skills/paper-summary에 설치하고 필요한 파이썬 패키지도 설치해줘</w:t>
+      </w:r>
+    </w:p>
+    <w:p>
+      <w:r>
+        <w:rPr>
+          <w:rFonts w:ascii="맑은 고딕" w:hAnsi="맑은 고딕" w:eastAsia="맑은 고딕"/>
+          <w:b w:val="0"/>
+        </w:rPr>
+        <w:t>설치가 끝나면 Claude Code를 다시 시작하고 이렇게 확인합니다.</w:t>
+      </w:r>
+    </w:p>
+    <w:p>
+      <w:pPr>
+        <w:spacing w:after="160" w:line="264" w:lineRule="auto"/>
+        <w:ind w:left="170"/>
+        <w:shd w:val="clear" w:color="auto" w:fill="F2F4F5"/>
+      </w:pPr>
+      <w:r>
+        <w:rPr>
+          <w:rFonts w:ascii="Consolas" w:hAnsi="Consolas" w:eastAsia="맑은 고딕"/>
+          <w:sz w:val="18"/>
+        </w:rPr>
+        <w:t>paper-summary 스킬로 arXiv 2510.27028 논문 라이브러리에 추가해봐</w:t>
+      </w:r>
+    </w:p>
+    <w:p>
+      <w:pPr>
+        <w:pStyle w:val="ListBullet"/>
+      </w:pPr>
+      <w:r>
+        <w:rPr>
+          <w:rFonts w:ascii="맑은 고딕" w:hAnsi="맑은 고딕" w:eastAsia="맑은 고딕"/>
+          <w:b w:val="0"/>
+        </w:rPr>
+        <w:t xml:space="preserve">주제 검색을 쓰려면 claude.ai → 설정 → 커넥터에서 </w:t>
+      </w:r>
+      <w:r>
+        <w:rPr>
+          <w:rFonts w:ascii="맑은 고딕" w:hAnsi="맑은 고딕" w:eastAsia="맑은 고딕"/>
+          <w:b/>
+        </w:rPr>
+        <w:t>SciSpace</w:t>
+      </w:r>
+      <w:r>
+        <w:rPr>
+          <w:rFonts w:ascii="맑은 고딕" w:hAnsi="맑은 고딕" w:eastAsia="맑은 고딕"/>
+          <w:b w:val="0"/>
+        </w:rPr>
+        <w:t>를 연결하세요. PubMed, alphaXiv 커넥터도 연결하면 검색 범위가 넓어집니다.</w:t>
+      </w:r>
+    </w:p>
+    <w:p>
+      <w:pPr>
+        <w:pStyle w:val="ListBullet"/>
+      </w:pPr>
+      <w:r>
+        <w:rPr>
+          <w:rFonts w:ascii="맑은 고딕" w:hAnsi="맑은 고딕" w:eastAsia="맑은 고딕"/>
+          <w:b w:val="0"/>
+        </w:rPr>
+        <w:t>커넥터가 없어도 DOI·arXiv 번호·PDF로 논문을 추가하고 요약·인용하는 기능은 그대로 됩니다.</w:t>
+      </w:r>
+    </w:p>
+    <w:p>
+      <w:pPr>
+        <w:pStyle w:val="Heading2"/>
+      </w:pPr>
+      <w:r>
+        <w:t>3. 주제로 문헌 조사</w:t>
       </w:r>
     </w:p>
     <w:p>
@@ -334,7 +481,21 @@
           <w:rFonts w:ascii="Consolas" w:hAnsi="Consolas" w:eastAsia="맑은 고딕"/>
           <w:sz w:val="18"/>
         </w:rPr>
-        <w:t>git clone https://github.com/emilyJ7/paper-summary.git "$HOME\.claude\skills\paper-summary"</w:t>
+        <w:t>/paper-summary rPPG 기반 심박·HRV 추정 정확도 연구 정리해줘</w:t>
+      </w:r>
+    </w:p>
+    <w:p>
+      <w:pPr>
+        <w:spacing w:after="0" w:line="264" w:lineRule="auto"/>
+        <w:ind w:left="170"/>
+        <w:shd w:val="clear" w:color="auto" w:fill="F2F4F5"/>
+      </w:pPr>
+      <w:r>
+        <w:rPr>
+          <w:rFonts w:ascii="Consolas" w:hAnsi="Consolas" w:eastAsia="맑은 고딕"/>
+          <w:sz w:val="18"/>
+        </w:rPr>
+        <w:t>/paper-summary 최근 3년 LLM 에이전트 메모리 연구 10편 정도 비교해줘</w:t>
       </w:r>
     </w:p>
     <w:p>
@@ -348,15 +509,25 @@
           <w:rFonts w:ascii="Consolas" w:hAnsi="Consolas" w:eastAsia="맑은 고딕"/>
           <w:sz w:val="18"/>
         </w:rPr>
-        <w:t>python -m pip install -r "$HOME\.claude\skills\paper-summary\requirements.txt"</w:t>
+        <w:t>/paper-summary 노쇠(frailty) 예측 연구, 임상 논문 위주로 찾아줘</w:t>
       </w:r>
     </w:p>
     <w:p>
-      <w:pPr>
-        <w:pStyle w:val="Heading3"/>
-      </w:pPr>
       <w:r>
-        <w:t>macOS / Linux</w:t>
+        <w:rPr>
+          <w:rFonts w:ascii="맑은 고딕" w:hAnsi="맑은 고딕" w:eastAsia="맑은 고딕"/>
+          <w:b w:val="0"/>
+        </w:rPr>
+        <w:t>Claude가 하는 일: 주제를 검색 질문으로 바꿔 SciSpace에서 찾고, 5~10편을 골라 핵심 요약, 비교표, 논문별 메모, 연구 공백, 참고문헌 순서로 정리합니다.</w:t>
+      </w:r>
+    </w:p>
+    <w:p>
+      <w:r>
+        <w:rPr>
+          <w:rFonts w:ascii="맑은 고딕" w:hAnsi="맑은 고딕" w:eastAsia="맑은 고딕"/>
+          <w:b w:val="0"/>
+        </w:rPr>
+        <w:t>이어서 이렇게 말할 수 있습니다.</w:t>
       </w:r>
     </w:p>
     <w:p>
@@ -370,7 +541,21 @@
           <w:rFonts w:ascii="Consolas" w:hAnsi="Consolas" w:eastAsia="맑은 고딕"/>
           <w:sz w:val="18"/>
         </w:rPr>
-        <w:t>git clone https://github.com/emilyJ7/paper-summary.git ~/.claude/skills/paper-summary</w:t>
+        <w:t>여기서 고른 논문들 라이브러리에도 등록해줘</w:t>
+      </w:r>
+    </w:p>
+    <w:p>
+      <w:pPr>
+        <w:spacing w:after="0" w:line="264" w:lineRule="auto"/>
+        <w:ind w:left="170"/>
+        <w:shd w:val="clear" w:color="auto" w:fill="F2F4F5"/>
+      </w:pPr>
+      <w:r>
+        <w:rPr>
+          <w:rFonts w:ascii="Consolas" w:hAnsi="Consolas" w:eastAsia="맑은 고딕"/>
+          <w:sz w:val="18"/>
+        </w:rPr>
+        <w:t>이 결과 한글(hwpx) 문서로 만들어줘</w:t>
       </w:r>
     </w:p>
     <w:p>
@@ -384,15 +569,57 @@
           <w:rFonts w:ascii="Consolas" w:hAnsi="Consolas" w:eastAsia="맑은 고딕"/>
           <w:sz w:val="18"/>
         </w:rPr>
-        <w:t>python3 -m pip install -r ~/.claude/skills/paper-summary/requirements.txt</w:t>
+        <w:t>2번하고 5번 논문만 더 자세히 비교해줘</w:t>
       </w:r>
     </w:p>
     <w:p>
       <w:pPr>
-        <w:pStyle w:val="Heading3"/>
+        <w:ind w:left="227"/>
+        <w:shd w:val="clear" w:color="auto" w:fill="EEF5F4"/>
       </w:pPr>
       <w:r>
-        <w:t>설치 확인</w:t>
+        <w:rPr>
+          <w:rFonts w:ascii="맑은 고딕" w:hAnsi="맑은 고딕" w:eastAsia="맑은 고딕"/>
+          <w:b w:val="0"/>
+          <w:sz w:val="20"/>
+        </w:rPr>
+        <w:t>조건(기간, 대상, 논문 수, 분야)을 함께 말하면 결과가 더 정확합니다.</w:t>
+      </w:r>
+    </w:p>
+    <w:p>
+      <w:pPr>
+        <w:pStyle w:val="Heading2"/>
+      </w:pPr>
+      <w:r>
+        <w:t>4. 논문 한 편 저장과 요약</w:t>
+      </w:r>
+    </w:p>
+    <w:p>
+      <w:pPr>
+        <w:spacing w:after="0" w:line="264" w:lineRule="auto"/>
+        <w:ind w:left="170"/>
+        <w:shd w:val="clear" w:color="auto" w:fill="F2F4F5"/>
+      </w:pPr>
+      <w:r>
+        <w:rPr>
+          <w:rFonts w:ascii="Consolas" w:hAnsi="Consolas" w:eastAsia="맑은 고딕"/>
+          <w:sz w:val="18"/>
+        </w:rPr>
+        <w:t>이 논문 라이브러리에 추가하고 요약해줘: 10.1038/s41598-026-70292-0</w:t>
+      </w:r>
+    </w:p>
+    <w:p>
+      <w:pPr>
+        <w:spacing w:after="0" w:line="264" w:lineRule="auto"/>
+        <w:ind w:left="170"/>
+        <w:shd w:val="clear" w:color="auto" w:fill="F2F4F5"/>
+      </w:pPr>
+      <w:r>
+        <w:rPr>
+          <w:rFonts w:ascii="Consolas" w:hAnsi="Consolas" w:eastAsia="맑은 고딕"/>
+          <w:sz w:val="18"/>
+        </w:rPr>
+        <w:t>arXiv 2601.09742 요약해서 라이브러리에 넣어줘</w:t>
       </w:r>
     </w:p>
     <w:p>
@@ -406,294 +633,7 @@
           <w:rFonts w:ascii="Consolas" w:hAnsi="Consolas" w:eastAsia="맑은 고딕"/>
           <w:sz w:val="18"/>
         </w:rPr>
-        <w:t>python ~/.claude/skills/paper-summary/scripts/paperlib.py add 2510.27028</w:t>
-      </w:r>
-    </w:p>
-    <w:p>
-      <w:pPr>
-        <w:pStyle w:val="ListBullet"/>
-      </w:pPr>
-      <w:r>
-        <w:rPr>
-          <w:rFonts w:ascii="Consolas" w:hAnsi="Consolas" w:eastAsia="맑은 고딕"/>
-          <w:color w:val="8A2B2B"/>
-          <w:sz w:val="19"/>
-        </w:rPr>
-        <w:t>~/paper-library/papers/Rouast2025vitallens/</w:t>
-      </w:r>
-      <w:r>
-        <w:rPr>
-          <w:rFonts w:ascii="맑은 고딕" w:hAnsi="맑은 고딕" w:eastAsia="맑은 고딕"/>
-          <w:b w:val="0"/>
-        </w:rPr>
-        <w:t xml:space="preserve"> 폴더가 생기면 성공입니다.</w:t>
-      </w:r>
-    </w:p>
-    <w:p>
-      <w:pPr>
-        <w:pStyle w:val="ListBullet"/>
-      </w:pPr>
-      <w:r>
-        <w:rPr>
-          <w:rFonts w:ascii="맑은 고딕" w:hAnsi="맑은 고딕" w:eastAsia="맑은 고딕"/>
-          <w:b w:val="0"/>
-        </w:rPr>
-        <w:t xml:space="preserve">Claude Code를 다시 시작하면 스킬 목록에 </w:t>
-      </w:r>
-      <w:r>
-        <w:rPr>
-          <w:rFonts w:ascii="Consolas" w:hAnsi="Consolas" w:eastAsia="맑은 고딕"/>
-          <w:color w:val="8A2B2B"/>
-          <w:sz w:val="19"/>
-        </w:rPr>
-        <w:t>paper-summary</w:t>
-      </w:r>
-      <w:r>
-        <w:rPr>
-          <w:rFonts w:ascii="맑은 고딕" w:hAnsi="맑은 고딕" w:eastAsia="맑은 고딕"/>
-          <w:b w:val="0"/>
-        </w:rPr>
-        <w:t>가 보입니다.</w:t>
-      </w:r>
-    </w:p>
-    <w:p>
-      <w:pPr>
-        <w:pStyle w:val="Heading3"/>
-      </w:pPr>
-      <w:r>
-        <w:t>(선택) SciSpace 검색 연결</w:t>
-      </w:r>
-    </w:p>
-    <w:p>
-      <w:pPr>
-        <w:pStyle w:val="ListBullet"/>
-      </w:pPr>
-      <w:r>
-        <w:rPr>
-          <w:rFonts w:ascii="맑은 고딕" w:hAnsi="맑은 고딕" w:eastAsia="맑은 고딕"/>
-          <w:b w:val="0"/>
-        </w:rPr>
-        <w:t>주제 검색(①)에는 claude.ai의 SciSpace 커넥터를 씁니다. claude.ai → 설정 → 커넥터에서 각자 자기 계정에 연결하세요.</w:t>
-      </w:r>
-    </w:p>
-    <w:p>
-      <w:pPr>
-        <w:pStyle w:val="ListBullet"/>
-      </w:pPr>
-      <w:r>
-        <w:rPr>
-          <w:rFonts w:ascii="맑은 고딕" w:hAnsi="맑은 고딕" w:eastAsia="맑은 고딕"/>
-          <w:b w:val="0"/>
-        </w:rPr>
-        <w:t>PubMed, alphaXiv, bioRxiv 커넥터도 연결하면 검색 범위가 넓어집니다.</w:t>
-      </w:r>
-    </w:p>
-    <w:p>
-      <w:pPr>
-        <w:pStyle w:val="ListBullet"/>
-      </w:pPr>
-      <w:r>
-        <w:rPr>
-          <w:rFonts w:ascii="맑은 고딕" w:hAnsi="맑은 고딕" w:eastAsia="맑은 고딕"/>
-          <w:b w:val="0"/>
-        </w:rPr>
-        <w:t>커넥터가 없어도 DOI·arXiv 번호·PDF로 논문을 추가하는 ②와 집필하는 ③은 그대로 쓸 수 있습니다.</w:t>
-      </w:r>
-    </w:p>
-    <w:p>
-      <w:pPr>
-        <w:pStyle w:val="Heading2"/>
-      </w:pPr>
-      <w:r>
-        <w:t>3. 사용법 ① — 주제로 문헌 조사</w:t>
-      </w:r>
-    </w:p>
-    <w:p>
-      <w:pPr>
-        <w:ind w:left="357" w:hanging="357"/>
-      </w:pPr>
-      <w:r>
-        <w:rPr>
-          <w:rFonts w:ascii="맑은 고딕" w:hAnsi="맑은 고딕" w:eastAsia="맑은 고딕"/>
-          <w:b/>
-          <w:color w:val="0B5C5A"/>
-        </w:rPr>
-        <w:t>1.</w:t>
-        <w:tab/>
-      </w:r>
-      <w:r>
-        <w:rPr>
-          <w:rFonts w:ascii="Consolas" w:hAnsi="Consolas" w:eastAsia="맑은 고딕"/>
-          <w:color w:val="8A2B2B"/>
-          <w:sz w:val="19"/>
-        </w:rPr>
-        <w:t>/paper-summary &lt;주제&gt;</w:t>
-      </w:r>
-      <w:r>
-        <w:rPr>
-          <w:rFonts w:ascii="맑은 고딕" w:hAnsi="맑은 고딕" w:eastAsia="맑은 고딕"/>
-          <w:b w:val="0"/>
-        </w:rPr>
-        <w:t>로 요청합니다. 기간, 대상, 논문 수 같은 조건이 있으면 함께 말합니다.</w:t>
-      </w:r>
-    </w:p>
-    <w:p>
-      <w:pPr>
-        <w:ind w:left="357" w:hanging="357"/>
-      </w:pPr>
-      <w:r>
-        <w:rPr>
-          <w:rFonts w:ascii="맑은 고딕" w:hAnsi="맑은 고딕" w:eastAsia="맑은 고딕"/>
-          <w:b/>
-          <w:color w:val="0B5C5A"/>
-        </w:rPr>
-        <w:t>2.</w:t>
-        <w:tab/>
-      </w:r>
-      <w:r>
-        <w:rPr>
-          <w:rFonts w:ascii="맑은 고딕" w:hAnsi="맑은 고딕" w:eastAsia="맑은 고딕"/>
-          <w:b w:val="0"/>
-        </w:rPr>
-        <w:t>Claude가 주제를 영어 검색 질문으로 바꿔 SciSpace에서 찾고, 5~10편을 고릅니다.</w:t>
-      </w:r>
-    </w:p>
-    <w:p>
-      <w:pPr>
-        <w:ind w:left="357" w:hanging="357"/>
-      </w:pPr>
-      <w:r>
-        <w:rPr>
-          <w:rFonts w:ascii="맑은 고딕" w:hAnsi="맑은 고딕" w:eastAsia="맑은 고딕"/>
-          <w:b/>
-          <w:color w:val="0B5C5A"/>
-        </w:rPr>
-        <w:t>3.</w:t>
-        <w:tab/>
-      </w:r>
-      <w:r>
-        <w:rPr>
-          <w:rFonts w:ascii="맑은 고딕" w:hAnsi="맑은 고딕" w:eastAsia="맑은 고딕"/>
-          <w:b w:val="0"/>
-        </w:rPr>
-        <w:t>필요하면 의학은 PubMed, 공학은 alphaXiv로 보강 검색을 합니다.</w:t>
-      </w:r>
-    </w:p>
-    <w:p>
-      <w:pPr>
-        <w:ind w:left="357" w:hanging="357"/>
-      </w:pPr>
-      <w:r>
-        <w:rPr>
-          <w:rFonts w:ascii="맑은 고딕" w:hAnsi="맑은 고딕" w:eastAsia="맑은 고딕"/>
-          <w:b/>
-          <w:color w:val="0B5C5A"/>
-        </w:rPr>
-        <w:t>4.</w:t>
-        <w:tab/>
-      </w:r>
-      <w:r>
-        <w:rPr>
-          <w:rFonts w:ascii="맑은 고딕" w:hAnsi="맑은 고딕" w:eastAsia="맑은 고딕"/>
-          <w:b w:val="0"/>
-        </w:rPr>
-        <w:t>결과는 핵심 요약, 비교표, 논문별 메모, 연구 공백, 참고문헌 순서로 정리됩니다.</w:t>
-      </w:r>
-    </w:p>
-    <w:p>
-      <w:pPr>
-        <w:ind w:left="357" w:hanging="357"/>
-      </w:pPr>
-      <w:r>
-        <w:rPr>
-          <w:rFonts w:ascii="맑은 고딕" w:hAnsi="맑은 고딕" w:eastAsia="맑은 고딕"/>
-          <w:b/>
-          <w:color w:val="0B5C5A"/>
-        </w:rPr>
-        <w:t>5.</w:t>
-        <w:tab/>
-      </w:r>
-      <w:r>
-        <w:rPr>
-          <w:rFonts w:ascii="맑은 고딕" w:hAnsi="맑은 고딕" w:eastAsia="맑은 고딕"/>
-          <w:b w:val="0"/>
-        </w:rPr>
-        <w:t>"라이브러리에도 등록해줘"라고 하면 고른 논문을 ② 방식으로 저장합니다.</w:t>
-      </w:r>
-    </w:p>
-    <w:p>
-      <w:pPr>
-        <w:ind w:left="227"/>
-        <w:shd w:val="clear" w:color="auto" w:fill="EEF5F4"/>
-      </w:pPr>
-      <w:r>
-        <w:rPr>
-          <w:rFonts w:ascii="맑은 고딕" w:hAnsi="맑은 고딕" w:eastAsia="맑은 고딕"/>
-          <w:b w:val="0"/>
-          <w:sz w:val="20"/>
-        </w:rPr>
-        <w:t xml:space="preserve">팁: 결과를 한글(hwpx)로 받으려면 </w:t>
-      </w:r>
-      <w:r>
-        <w:rPr>
-          <w:rFonts w:ascii="Consolas" w:hAnsi="Consolas" w:eastAsia="맑은 고딕"/>
-          <w:color w:val="8A2B2B"/>
-          <w:sz w:val="18"/>
-        </w:rPr>
-        <w:t>hwpx-template</w:t>
-      </w:r>
-      <w:r>
-        <w:rPr>
-          <w:rFonts w:ascii="맑은 고딕" w:hAnsi="맑은 고딕" w:eastAsia="맑은 고딕"/>
-          <w:b w:val="0"/>
-          <w:sz w:val="20"/>
-        </w:rPr>
-        <w:t xml:space="preserve"> 스킬이 설치되어 있어야 합니다. Word·PDF가 필요하면 그렇게 요청하면 됩니다.</w:t>
-      </w:r>
-    </w:p>
-    <w:p>
-      <w:pPr>
-        <w:pStyle w:val="Heading2"/>
-      </w:pPr>
-      <w:r>
-        <w:t>4. 사용법 ② — 논문 저장과 요약 노트</w:t>
-      </w:r>
-    </w:p>
-    <w:p>
-      <w:r>
-        <w:rPr>
-          <w:rFonts w:ascii="맑은 고딕" w:hAnsi="맑은 고딕" w:eastAsia="맑은 고딕"/>
-          <w:b w:val="0"/>
-        </w:rPr>
-        <w:t>입력할 수 있는 것: DOI, arXiv 번호나 URL, PDF 파일 경로, PDF URL</w:t>
-      </w:r>
-    </w:p>
-    <w:p>
-      <w:pPr>
-        <w:spacing w:after="0" w:line="264" w:lineRule="auto"/>
-        <w:ind w:left="170"/>
-        <w:shd w:val="clear" w:color="auto" w:fill="F2F4F5"/>
-      </w:pPr>
-      <w:r>
-        <w:rPr>
-          <w:rFonts w:ascii="Consolas" w:hAnsi="Consolas" w:eastAsia="맑은 고딕"/>
-          <w:sz w:val="18"/>
-        </w:rPr>
-        <w:t>이 논문 라이브러리에 추가하고 요약해줘: 2510.27028</w:t>
-      </w:r>
-    </w:p>
-    <w:p>
-      <w:pPr>
-        <w:spacing w:after="160" w:line="264" w:lineRule="auto"/>
-        <w:ind w:left="170"/>
-        <w:shd w:val="clear" w:color="auto" w:fill="F2F4F5"/>
-      </w:pPr>
-      <w:r>
-        <w:rPr>
-          <w:rFonts w:ascii="Consolas" w:hAnsi="Consolas" w:eastAsia="맑은 고딕"/>
-          <w:sz w:val="18"/>
-        </w:rPr>
-        <w:t>C:\Downloads\paper.pdf 라이브러리에 넣고 요약해줘</w:t>
+        <w:t>C:\Users\me\Desktop\paper.pdf 논문 요약해줘</w:t>
       </w:r>
     </w:p>
     <w:p>
@@ -723,7 +663,7 @@
           <w:rFonts w:ascii="맑은 고딕" w:hAnsi="맑은 고딕" w:eastAsia="맑은 고딕"/>
           <w:b w:val="0"/>
         </w:rPr>
-        <w:t>서지 정보(제목, 저자, 연도, 학술지, DOI)를 무료 API에서 가져옵니다.</w:t>
+        <w:t>서지 정보(제목, 저자, 연도, 학술지, DOI)를 가져옵니다.</w:t>
       </w:r>
     </w:p>
     <w:p>
@@ -744,22 +684,7 @@
           <w:rFonts w:ascii="맑은 고딕" w:hAnsi="맑은 고딕" w:eastAsia="맑은 고딕"/>
           <w:b w:val="0"/>
         </w:rPr>
-        <w:t>공개 PDF가 있으면 내려받아 쪽 번호가 표시된 본문(</w:t>
-      </w:r>
-      <w:r>
-        <w:rPr>
-          <w:rFonts w:ascii="Consolas" w:hAnsi="Consolas" w:eastAsia="맑은 고딕"/>
-          <w:color w:val="8A2B2B"/>
-          <w:sz w:val="19"/>
-        </w:rPr>
-        <w:t>text.md</w:t>
-      </w:r>
-      <w:r>
-        <w:rPr>
-          <w:rFonts w:ascii="맑은 고딕" w:hAnsi="맑은 고딕" w:eastAsia="맑은 고딕"/>
-          <w:b w:val="0"/>
-        </w:rPr>
-        <w:t>)을 만듭니다.</w:t>
+        <w:t>본문을 쪽 번호와 함께 저장하고, 그림을 캡션 기준으로 잘라 저장합니다.</w:t>
       </w:r>
     </w:p>
     <w:p>
@@ -780,7 +705,7 @@
           <w:rFonts w:ascii="맑은 고딕" w:hAnsi="맑은 고딕" w:eastAsia="맑은 고딕"/>
           <w:b w:val="0"/>
         </w:rPr>
-        <w:t xml:space="preserve">「Figure N」 캡션을 기준으로 그림을 잘라 </w:t>
+        <w:t>본문을 읽고 요약 노트를 씁니다. 모든 사실 문장에 출처와 쪽 번호(</w:t>
       </w:r>
       <w:r>
         <w:rPr>
@@ -788,14 +713,14 @@
           <w:color w:val="8A2B2B"/>
           <w:sz w:val="19"/>
         </w:rPr>
-        <w:t>figures/</w:t>
+        <w:t>[@Pstras2026estimating, p. 7]</w:t>
       </w:r>
       <w:r>
         <w:rPr>
           <w:rFonts w:ascii="맑은 고딕" w:hAnsi="맑은 고딕" w:eastAsia="맑은 고딕"/>
           <w:b w:val="0"/>
         </w:rPr>
-        <w:t>에 저장합니다.</w:t>
+        <w:t>)를 답니다.</w:t>
       </w:r>
     </w:p>
     <w:p>
@@ -816,87 +741,7 @@
           <w:rFonts w:ascii="맑은 고딕" w:hAnsi="맑은 고딕" w:eastAsia="맑은 고딕"/>
           <w:b w:val="0"/>
         </w:rPr>
-        <w:t>본문을 읽고 요약 노트(</w:t>
-      </w:r>
-      <w:r>
-        <w:rPr>
-          <w:rFonts w:ascii="Consolas" w:hAnsi="Consolas" w:eastAsia="맑은 고딕"/>
-          <w:color w:val="8A2B2B"/>
-          <w:sz w:val="19"/>
-        </w:rPr>
-        <w:t>summary.md</w:t>
-      </w:r>
-      <w:r>
-        <w:rPr>
-          <w:rFonts w:ascii="맑은 고딕" w:hAnsi="맑은 고딕" w:eastAsia="맑은 고딕"/>
-          <w:b w:val="0"/>
-        </w:rPr>
-        <w:t>)를 씁니다. 섹션은 Essence, Motivation, How, Achievement, Limitations, 메모 순서입니다.</w:t>
-      </w:r>
-    </w:p>
-    <w:p>
-      <w:pPr>
-        <w:ind w:left="357" w:hanging="357"/>
-      </w:pPr>
-      <w:r>
-        <w:rPr>
-          <w:rFonts w:ascii="맑은 고딕" w:hAnsi="맑은 고딕" w:eastAsia="맑은 고딕"/>
-          <w:b/>
-          <w:color w:val="0B5C5A"/>
-        </w:rPr>
-        <w:t>5.</w:t>
-        <w:tab/>
-      </w:r>
-      <w:r>
-        <w:rPr>
-          <w:rFonts w:ascii="맑은 고딕" w:hAnsi="맑은 고딕" w:eastAsia="맑은 고딕"/>
-          <w:b w:val="0"/>
-        </w:rPr>
-        <w:t xml:space="preserve">요약 노트의 모든 사실 문장에는 출처 키와 쪽 번호를 답니다. 예: </w:t>
-      </w:r>
-      <w:r>
-        <w:rPr>
-          <w:rFonts w:ascii="Consolas" w:hAnsi="Consolas" w:eastAsia="맑은 고딕"/>
-          <w:color w:val="8A2B2B"/>
-          <w:sz w:val="19"/>
-        </w:rPr>
-        <w:t>[@Pstras2026estimating, p. 7]</w:t>
-      </w:r>
-    </w:p>
-    <w:p>
-      <w:pPr>
-        <w:ind w:left="357" w:hanging="357"/>
-      </w:pPr>
-      <w:r>
-        <w:rPr>
-          <w:rFonts w:ascii="맑은 고딕" w:hAnsi="맑은 고딕" w:eastAsia="맑은 고딕"/>
-          <w:b/>
-          <w:color w:val="0B5C5A"/>
-        </w:rPr>
-        <w:t>6.</w:t>
-        <w:tab/>
-      </w:r>
-      <w:r>
-        <w:rPr>
-          <w:rFonts w:ascii="맑은 고딕" w:hAnsi="맑은 고딕" w:eastAsia="맑은 고딕"/>
-          <w:b w:val="0"/>
-        </w:rPr>
-        <w:t>보기용 HTML 페이지(</w:t>
-      </w:r>
-      <w:r>
-        <w:rPr>
-          <w:rFonts w:ascii="Consolas" w:hAnsi="Consolas" w:eastAsia="맑은 고딕"/>
-          <w:color w:val="8A2B2B"/>
-          <w:sz w:val="19"/>
-        </w:rPr>
-        <w:t>index.html</w:t>
-      </w:r>
-      <w:r>
-        <w:rPr>
-          <w:rFonts w:ascii="맑은 고딕" w:hAnsi="맑은 고딕" w:eastAsia="맑은 고딕"/>
-          <w:b w:val="0"/>
-        </w:rPr>
-        <w:t>)를 만듭니다.</w:t>
+        <w:t>브라우저로 볼 수 있는 페이지를 만듭니다.</w:t>
       </w:r>
     </w:p>
     <w:p>
@@ -905,34 +750,63 @@
           <w:rFonts w:ascii="맑은 고딕" w:hAnsi="맑은 고딕" w:eastAsia="맑은 고딕"/>
           <w:b w:val="0"/>
         </w:rPr>
-        <w:t>유의할 점:</w:t>
+        <w:t>요약이 끝난 뒤에는 이렇게 말할 수 있습니다.</w:t>
       </w:r>
     </w:p>
     <w:p>
       <w:pPr>
-        <w:pStyle w:val="ListBullet"/>
+        <w:spacing w:after="0" w:line="264" w:lineRule="auto"/>
+        <w:ind w:left="170"/>
+        <w:shd w:val="clear" w:color="auto" w:fill="F2F4F5"/>
       </w:pPr>
       <w:r>
         <w:rPr>
-          <w:rFonts w:ascii="맑은 고딕" w:hAnsi="맑은 고딕" w:eastAsia="맑은 고딕"/>
-          <w:b w:val="0"/>
+          <w:rFonts w:ascii="Consolas" w:hAnsi="Consolas" w:eastAsia="맑은 고딕"/>
+          <w:sz w:val="18"/>
         </w:rPr>
-        <w:t xml:space="preserve">디스크가 부족하면 "PDF는 지워줘"라고 하세요. </w:t>
+        <w:t>방금 요약한 논문 HTML로 열어줘</w:t>
       </w:r>
+    </w:p>
+    <w:p>
+      <w:pPr>
+        <w:spacing w:after="0" w:line="264" w:lineRule="auto"/>
+        <w:ind w:left="170"/>
+        <w:shd w:val="clear" w:color="auto" w:fill="F2F4F5"/>
+      </w:pPr>
       <w:r>
         <w:rPr>
           <w:rFonts w:ascii="Consolas" w:hAnsi="Consolas" w:eastAsia="맑은 고딕"/>
-          <w:color w:val="8A2B2B"/>
-          <w:sz w:val="19"/>
+          <w:sz w:val="18"/>
         </w:rPr>
-        <w:t>--no-pdf</w:t>
+        <w:t>이 논문 그림 1 설명해줘</w:t>
       </w:r>
+    </w:p>
+    <w:p>
+      <w:pPr>
+        <w:spacing w:after="0" w:line="264" w:lineRule="auto"/>
+        <w:ind w:left="170"/>
+        <w:shd w:val="clear" w:color="auto" w:fill="F2F4F5"/>
+      </w:pPr>
       <w:r>
         <w:rPr>
-          <w:rFonts w:ascii="맑은 고딕" w:hAnsi="맑은 고딕" w:eastAsia="맑은 고딕"/>
-          <w:b w:val="0"/>
+          <w:rFonts w:ascii="Consolas" w:hAnsi="Consolas" w:eastAsia="맑은 고딕"/>
+          <w:sz w:val="18"/>
         </w:rPr>
-        <w:t xml:space="preserve"> 옵션으로 추출만 하고 PDF는 남기지 않습니다.</w:t>
+        <w:t>요약에서 Limitations 부분 더 자세히 써줘</w:t>
+      </w:r>
+    </w:p>
+    <w:p>
+      <w:pPr>
+        <w:spacing w:after="160" w:line="264" w:lineRule="auto"/>
+        <w:ind w:left="170"/>
+        <w:shd w:val="clear" w:color="auto" w:fill="F2F4F5"/>
+      </w:pPr>
+      <w:r>
+        <w:rPr>
+          <w:rFonts w:ascii="Consolas" w:hAnsi="Consolas" w:eastAsia="맑은 고딕"/>
+          <w:sz w:val="18"/>
+        </w:rPr>
+        <w:t>디스크가 부족하니 PDF는 지워줘</w:t>
       </w:r>
     </w:p>
     <w:p>
@@ -940,7 +814,21 @@
         <w:pStyle w:val="Heading3"/>
       </w:pPr>
       <w:r>
-        <w:t>유료 논문 (초록만 있는 경우)</w:t>
+        <w:t>유료 논문 (초록만 있을 때)</w:t>
+      </w:r>
+    </w:p>
+    <w:p>
+      <w:pPr>
+        <w:spacing w:after="160" w:line="264" w:lineRule="auto"/>
+        <w:ind w:left="170"/>
+        <w:shd w:val="clear" w:color="auto" w:fill="F2F4F5"/>
+      </w:pPr>
+      <w:r>
+        <w:rPr>
+          <w:rFonts w:ascii="Consolas" w:hAnsi="Consolas" w:eastAsia="맑은 고딕"/>
+          <w:sz w:val="18"/>
+        </w:rPr>
+        <w:t>이 논문 추가해줘: 10.1016/j.smhl.2026.100683</w:t>
       </w:r>
     </w:p>
     <w:p>
@@ -961,7 +849,7 @@
           <w:rFonts w:ascii="맑은 고딕" w:hAnsi="맑은 고딕" w:eastAsia="맑은 고딕"/>
           <w:b w:val="0"/>
         </w:rPr>
-        <w:t xml:space="preserve">DOI로 추가하면 서지와 초록만 저장되고, 목록에 </w:t>
+        <w:t xml:space="preserve">공개 PDF가 없으면 서지 정보와 초록만 저장되고, 목록에 </w:t>
       </w:r>
       <w:r>
         <w:rPr>
@@ -997,22 +885,21 @@
           <w:rFonts w:ascii="맑은 고딕" w:hAnsi="맑은 고딕" w:eastAsia="맑은 고딕"/>
           <w:b w:val="0"/>
         </w:rPr>
-        <w:t xml:space="preserve">도서관이나 출판사에서 PDF를 받은 뒤 </w:t>
+        <w:t>도서관이나 출판사에서 PDF를 받으면 이렇게 말합니다.</w:t>
       </w:r>
+    </w:p>
+    <w:p>
+      <w:pPr>
+        <w:spacing w:after="160" w:line="264" w:lineRule="auto"/>
+        <w:ind w:left="170"/>
+        <w:shd w:val="clear" w:color="auto" w:fill="F2F4F5"/>
+      </w:pPr>
       <w:r>
         <w:rPr>
           <w:rFonts w:ascii="Consolas" w:hAnsi="Consolas" w:eastAsia="맑은 고딕"/>
-          <w:color w:val="8A2B2B"/>
-          <w:sz w:val="19"/>
+          <w:sz w:val="18"/>
         </w:rPr>
-        <w:t>이 PDF로 정리해줘: C:\Downloads\paper.pdf</w:t>
-      </w:r>
-      <w:r>
-        <w:rPr>
-          <w:rFonts w:ascii="맑은 고딕" w:hAnsi="맑은 고딕" w:eastAsia="맑은 고딕"/>
-          <w:b w:val="0"/>
-        </w:rPr>
-        <w:t>라고 말합니다.</w:t>
+        <w:t>이 PDF로 정리해줘: C:\Downloads\physqual.pdf</w:t>
       </w:r>
     </w:p>
     <w:p>
@@ -1033,7 +920,7 @@
           <w:rFonts w:ascii="맑은 고딕" w:hAnsi="맑은 고딕" w:eastAsia="맑은 고딕"/>
           <w:b w:val="0"/>
         </w:rPr>
-        <w:t>Claude가 PDF의 DOI나 제목으로 같은 항목을 찾아 본문과 그림을 채우고, 요약을 본문 기준(쪽 번호 인용 포함)으로 다시 씁니다. 기존 서지 정보는 그대로 유지됩니다.</w:t>
+        <w:t>Claude가 DOI나 제목으로 같은 논문을 찾아 본문과 그림을 채우고, 요약을 본문 기준으로 다시 씁니다.</w:t>
       </w:r>
     </w:p>
     <w:p>
@@ -1054,44 +941,21 @@
           <w:rFonts w:ascii="맑은 고딕" w:hAnsi="맑은 고딕" w:eastAsia="맑은 고딕"/>
           <w:b w:val="0"/>
         </w:rPr>
-        <w:t xml:space="preserve">스캔본처럼 제목을 읽을 수 없는 PDF는 citekey를 함께 알려 주세요. 예: </w:t>
-      </w:r>
-      <w:r>
-        <w:rPr>
-          <w:rFonts w:ascii="Consolas" w:hAnsi="Consolas" w:eastAsia="맑은 고딕"/>
-          <w:color w:val="8A2B2B"/>
-          <w:sz w:val="19"/>
-        </w:rPr>
-        <w:t>이 PDF를 Mohamad2026physqual에 붙여줘</w:t>
+        <w:t>스캔본처럼 제목을 읽을 수 없는 PDF는 어느 논문인지 알려 주세요.</w:t>
       </w:r>
     </w:p>
     <w:p>
       <w:pPr>
-        <w:ind w:left="357" w:hanging="357"/>
+        <w:spacing w:after="0" w:line="264" w:lineRule="auto"/>
+        <w:ind w:left="170"/>
+        <w:shd w:val="clear" w:color="auto" w:fill="F2F4F5"/>
       </w:pPr>
       <w:r>
         <w:rPr>
-          <w:rFonts w:ascii="맑은 고딕" w:hAnsi="맑은 고딕" w:eastAsia="맑은 고딕"/>
-          <w:b/>
-          <w:color w:val="0B5C5A"/>
+          <w:rFonts w:ascii="Consolas" w:hAnsi="Consolas" w:eastAsia="맑은 고딕"/>
+          <w:sz w:val="18"/>
         </w:rPr>
-        <w:t>5.</w:t>
-        <w:tab/>
-      </w:r>
-      <w:r>
-        <w:rPr>
-          <w:rFonts w:ascii="맑은 고딕" w:hAnsi="맑은 고딕" w:eastAsia="맑은 고딕"/>
-          <w:b w:val="0"/>
-        </w:rPr>
-        <w:t>PDF를 기다리는 논문은 "PDF 대기 목록 보여줘"로 모아 볼 수 있습니다.</w:t>
-      </w:r>
-    </w:p>
-    <w:p>
-      <w:pPr>
-        <w:pStyle w:val="Heading2"/>
-      </w:pPr>
-      <w:r>
-        <w:t>5. 사용법 ③ — 글쓰기와 자동 인용</w:t>
+        <w:t>이 PDF를 Mohamad2026physqual에 붙여줘: C:\Downloads\scan.pdf</w:t>
       </w:r>
     </w:p>
     <w:p>
@@ -1105,49 +969,198 @@
           <w:rFonts w:ascii="Consolas" w:hAnsi="Consolas" w:eastAsia="맑은 고딕"/>
           <w:sz w:val="18"/>
         </w:rPr>
-        <w:t>라이브러리의 HRV 논문들로 연구 배경 한 단락 써주고 참고문헌 IEEE로 달아줘</w:t>
+        <w:t>PDF 기다리는 논문 목록 보여줘</w:t>
       </w:r>
     </w:p>
     <w:p>
       <w:pPr>
-        <w:ind w:left="357" w:hanging="357"/>
+        <w:pStyle w:val="Heading2"/>
+      </w:pPr>
+      <w:r>
+        <w:t>5. 저장한 논문 찾고 보기</w:t>
+      </w:r>
+    </w:p>
+    <w:p>
+      <w:pPr>
+        <w:spacing w:after="0" w:line="264" w:lineRule="auto"/>
+        <w:ind w:left="170"/>
+        <w:shd w:val="clear" w:color="auto" w:fill="F2F4F5"/>
+      </w:pPr>
+      <w:r>
+        <w:rPr>
+          <w:rFonts w:ascii="Consolas" w:hAnsi="Consolas" w:eastAsia="맑은 고딕"/>
+          <w:sz w:val="18"/>
+        </w:rPr>
+        <w:t>라이브러리에 있는 논문 목록 보여줘</w:t>
+      </w:r>
+    </w:p>
+    <w:p>
+      <w:pPr>
+        <w:spacing w:after="0" w:line="264" w:lineRule="auto"/>
+        <w:ind w:left="170"/>
+        <w:shd w:val="clear" w:color="auto" w:fill="F2F4F5"/>
+      </w:pPr>
+      <w:r>
+        <w:rPr>
+          <w:rFonts w:ascii="Consolas" w:hAnsi="Consolas" w:eastAsia="맑은 고딕"/>
+          <w:sz w:val="18"/>
+        </w:rPr>
+        <w:t>라이브러리에서 SDNN 언급한 논문 찾아줘</w:t>
+      </w:r>
+    </w:p>
+    <w:p>
+      <w:pPr>
+        <w:spacing w:after="0" w:line="264" w:lineRule="auto"/>
+        <w:ind w:left="170"/>
+        <w:shd w:val="clear" w:color="auto" w:fill="F2F4F5"/>
+      </w:pPr>
+      <w:r>
+        <w:rPr>
+          <w:rFonts w:ascii="Consolas" w:hAnsi="Consolas" w:eastAsia="맑은 고딕"/>
+          <w:sz w:val="18"/>
+        </w:rPr>
+        <w:t>Sampath2026adaptive 요약 보여줘</w:t>
+      </w:r>
+    </w:p>
+    <w:p>
+      <w:pPr>
+        <w:spacing w:after="0" w:line="264" w:lineRule="auto"/>
+        <w:ind w:left="170"/>
+        <w:shd w:val="clear" w:color="auto" w:fill="F2F4F5"/>
+      </w:pPr>
+      <w:r>
+        <w:rPr>
+          <w:rFonts w:ascii="Consolas" w:hAnsi="Consolas" w:eastAsia="맑은 고딕"/>
+          <w:sz w:val="18"/>
+        </w:rPr>
+        <w:t>라이브러리 목록 페이지 열어줘</w:t>
+      </w:r>
+    </w:p>
+    <w:p>
+      <w:pPr>
+        <w:spacing w:after="160" w:line="264" w:lineRule="auto"/>
+        <w:ind w:left="170"/>
+        <w:shd w:val="clear" w:color="auto" w:fill="F2F4F5"/>
+      </w:pPr>
+      <w:r>
+        <w:rPr>
+          <w:rFonts w:ascii="Consolas" w:hAnsi="Consolas" w:eastAsia="맑은 고딕"/>
+          <w:sz w:val="18"/>
+        </w:rPr>
+        <w:t>아직 요약 안 한 논문 요약해줘</w:t>
+      </w:r>
+    </w:p>
+    <w:p>
+      <w:pPr>
+        <w:ind w:left="227"/>
+        <w:shd w:val="clear" w:color="auto" w:fill="EEF5F4"/>
       </w:pPr>
       <w:r>
         <w:rPr>
           <w:rFonts w:ascii="맑은 고딕" w:hAnsi="맑은 고딕" w:eastAsia="맑은 고딕"/>
-          <w:b/>
-          <w:color w:val="0B5C5A"/>
+          <w:b w:val="0"/>
+          <w:sz w:val="20"/>
         </w:rPr>
-        <w:t>1.</w:t>
-        <w:tab/>
+        <w:t xml:space="preserve">라이브러리는 </w:t>
+      </w:r>
+      <w:r>
+        <w:rPr>
+          <w:rFonts w:ascii="Consolas" w:hAnsi="Consolas" w:eastAsia="맑은 고딕"/>
+          <w:color w:val="8A2B2B"/>
+          <w:sz w:val="18"/>
+        </w:rPr>
+        <w:t>~/paper-library</w:t>
       </w:r>
       <w:r>
         <w:rPr>
           <w:rFonts w:ascii="맑은 고딕" w:hAnsi="맑은 고딕" w:eastAsia="맑은 고딕"/>
           <w:b w:val="0"/>
+          <w:sz w:val="20"/>
         </w:rPr>
-        <w:t>Claude가 라이브러리를 검색하고, 관련 논문의 요약 노트와 본문을 읽습니다.</w:t>
+        <w:t xml:space="preserve">에 있습니다. 논문마다 폴더가 하나씩 있고, 폴더 이름이 인용 키입니다(예: </w:t>
       </w:r>
-    </w:p>
-    <w:p>
-      <w:pPr>
-        <w:ind w:left="357" w:hanging="357"/>
-      </w:pPr>
       <w:r>
         <w:rPr>
-          <w:rFonts w:ascii="맑은 고딕" w:hAnsi="맑은 고딕" w:eastAsia="맑은 고딕"/>
-          <w:b/>
-          <w:color w:val="0B5C5A"/>
+          <w:rFonts w:ascii="Consolas" w:hAnsi="Consolas" w:eastAsia="맑은 고딕"/>
+          <w:color w:val="8A2B2B"/>
+          <w:sz w:val="18"/>
         </w:rPr>
-        <w:t>2.</w:t>
-        <w:tab/>
+        <w:t>Sampath2026adaptive</w:t>
       </w:r>
       <w:r>
         <w:rPr>
           <w:rFonts w:ascii="맑은 고딕" w:hAnsi="맑은 고딕" w:eastAsia="맑은 고딕"/>
           <w:b w:val="0"/>
+          <w:sz w:val="20"/>
         </w:rPr>
-        <w:t xml:space="preserve">원고에는 인용 키를 그대로 씁니다. 예: </w:t>
+        <w:t>).</w:t>
+      </w:r>
+    </w:p>
+    <w:p>
+      <w:pPr>
+        <w:pStyle w:val="Heading2"/>
+      </w:pPr>
+      <w:r>
+        <w:t>6. 글쓰기와 자동 인용</w:t>
+      </w:r>
+    </w:p>
+    <w:p>
+      <w:pPr>
+        <w:pStyle w:val="Heading3"/>
+      </w:pPr>
+      <w:r>
+        <w:t>Claude에게 글을 맡길 때</w:t>
+      </w:r>
+    </w:p>
+    <w:p>
+      <w:pPr>
+        <w:spacing w:after="0" w:line="264" w:lineRule="auto"/>
+        <w:ind w:left="170"/>
+        <w:shd w:val="clear" w:color="auto" w:fill="F2F4F5"/>
+      </w:pPr>
+      <w:r>
+        <w:rPr>
+          <w:rFonts w:ascii="Consolas" w:hAnsi="Consolas" w:eastAsia="맑은 고딕"/>
+          <w:sz w:val="18"/>
+        </w:rPr>
+        <w:t>라이브러리의 HRV 논문들로 연구 배경 한 단락 써주고 참고문헌 APA로 달아줘</w:t>
+      </w:r>
+    </w:p>
+    <w:p>
+      <w:pPr>
+        <w:spacing w:after="0" w:line="264" w:lineRule="auto"/>
+        <w:ind w:left="170"/>
+        <w:shd w:val="clear" w:color="auto" w:fill="F2F4F5"/>
+      </w:pPr>
+      <w:r>
+        <w:rPr>
+          <w:rFonts w:ascii="Consolas" w:hAnsi="Consolas" w:eastAsia="맑은 고딕"/>
+          <w:sz w:val="18"/>
+        </w:rPr>
+        <w:t>Sampath2026adaptive 내용을 인용해서 MCP 에이전트 설계 시사점 정리해줘</w:t>
+      </w:r>
+    </w:p>
+    <w:p>
+      <w:pPr>
+        <w:spacing w:after="160" w:line="264" w:lineRule="auto"/>
+        <w:ind w:left="170"/>
+        <w:shd w:val="clear" w:color="auto" w:fill="F2F4F5"/>
+      </w:pPr>
+      <w:r>
+        <w:rPr>
+          <w:rFonts w:ascii="Consolas" w:hAnsi="Consolas" w:eastAsia="맑은 고딕"/>
+          <w:sz w:val="18"/>
+        </w:rPr>
+        <w:t>요약한 rPPG 논문들로 선행연구 표 만들고 IEEE 참고문헌 붙여줘</w:t>
+      </w:r>
+    </w:p>
+    <w:p>
+      <w:r>
+        <w:rPr>
+          <w:rFonts w:ascii="맑은 고딕" w:hAnsi="맑은 고딕" w:eastAsia="맑은 고딕"/>
+          <w:b w:val="0"/>
+        </w:rPr>
+        <w:t>Claude는 요약 노트를 재료로 글을 쓰고, 인용 표시를 그대로 옮긴 뒤 본문 인용과 참고문헌 목록을 자동으로 만듭니다. 원고(인용 키 상태)와 완성본(</w:t>
       </w:r>
       <w:r>
         <w:rPr>
@@ -1155,36 +1168,14 @@
           <w:color w:val="8A2B2B"/>
           <w:sz w:val="19"/>
         </w:rPr>
-        <w:t>[@Pstras2026estimating, p. 7]</w:t>
-      </w:r>
-    </w:p>
-    <w:p>
-      <w:pPr>
-        <w:ind w:left="357" w:hanging="357"/>
-      </w:pPr>
-      <w:r>
-        <w:rPr>
-          <w:rFonts w:ascii="맑은 고딕" w:hAnsi="맑은 고딕" w:eastAsia="맑은 고딕"/>
-          <w:b/>
-          <w:color w:val="0B5C5A"/>
-        </w:rPr>
-        <w:t>3.</w:t>
-        <w:tab/>
-      </w:r>
-      <w:r>
-        <w:rPr>
-          <w:rFonts w:ascii="Consolas" w:hAnsi="Consolas" w:eastAsia="맑은 고딕"/>
-          <w:color w:val="8A2B2B"/>
-          <w:sz w:val="19"/>
-        </w:rPr>
-        <w:t>cite</w:t>
+        <w:t>_cited.md</w:t>
       </w:r>
       <w:r>
         <w:rPr>
           <w:rFonts w:ascii="맑은 고딕" w:hAnsi="맑은 고딕" w:eastAsia="맑은 고딕"/>
           <w:b w:val="0"/>
         </w:rPr>
-        <w:t xml:space="preserve"> 명령이 키를 본문 인용으로 바꾸고, 원고 끝에 참고문헌 목록을 붙입니다.</w:t>
+        <w:t>)이 함께 저장됩니다.</w:t>
       </w:r>
     </w:p>
     <w:p>
@@ -1192,7 +1183,131 @@
         <w:pStyle w:val="Heading3"/>
       </w:pPr>
       <w:r>
-        <w:t>인용 표기 규칙</w:t>
+        <w:t>내가 쓴 원고에 참고문헌만 달 때</w:t>
+      </w:r>
+    </w:p>
+    <w:p>
+      <w:r>
+        <w:rPr>
+          <w:rFonts w:ascii="맑은 고딕" w:hAnsi="맑은 고딕" w:eastAsia="맑은 고딕"/>
+          <w:b w:val="0"/>
+        </w:rPr>
+        <w:t>원고에 인용하고 싶은 자리마다 인용 키를 적어 두고 Claude에게 맡깁니다.</w:t>
+      </w:r>
+    </w:p>
+    <w:p>
+      <w:pPr>
+        <w:spacing w:after="0" w:line="264" w:lineRule="auto"/>
+        <w:ind w:left="170"/>
+        <w:shd w:val="clear" w:color="auto" w:fill="F2F4F5"/>
+      </w:pPr>
+      <w:r>
+        <w:rPr>
+          <w:rFonts w:ascii="Consolas" w:hAnsi="Consolas" w:eastAsia="맑은 고딕"/>
+          <w:sz w:val="18"/>
+        </w:rPr>
+        <w:t>도구가 많아지면 단일 에이전트는 선택이 흐려진다[@Sampath2026adaptive, p. 2].</w:t>
+      </w:r>
+    </w:p>
+    <w:p>
+      <w:pPr>
+        <w:spacing w:after="160" w:line="264" w:lineRule="auto"/>
+        <w:ind w:left="170"/>
+        <w:shd w:val="clear" w:color="auto" w:fill="F2F4F5"/>
+      </w:pPr>
+      <w:r>
+        <w:rPr>
+          <w:rFonts w:ascii="Consolas" w:hAnsi="Consolas" w:eastAsia="맑은 고딕"/>
+          <w:sz w:val="18"/>
+        </w:rPr>
+        <w:t>HRV는 카메라로도 추정할 수 있다[@Pstras2026estimating; @Rouast2025vitallens].</w:t>
+      </w:r>
+    </w:p>
+    <w:p>
+      <w:pPr>
+        <w:spacing w:after="0" w:line="264" w:lineRule="auto"/>
+        <w:ind w:left="170"/>
+        <w:shd w:val="clear" w:color="auto" w:fill="F2F4F5"/>
+      </w:pPr>
+      <w:r>
+        <w:rPr>
+          <w:rFonts w:ascii="Consolas" w:hAnsi="Consolas" w:eastAsia="맑은 고딕"/>
+          <w:sz w:val="18"/>
+        </w:rPr>
+        <w:t>draft.md 참고문헌 APA로 달아줘</w:t>
+      </w:r>
+    </w:p>
+    <w:p>
+      <w:pPr>
+        <w:spacing w:after="0" w:line="264" w:lineRule="auto"/>
+        <w:ind w:left="170"/>
+        <w:shd w:val="clear" w:color="auto" w:fill="F2F4F5"/>
+      </w:pPr>
+      <w:r>
+        <w:rPr>
+          <w:rFonts w:ascii="Consolas" w:hAnsi="Consolas" w:eastAsia="맑은 고딕"/>
+          <w:sz w:val="18"/>
+        </w:rPr>
+        <w:t>draft.md IEEE 형식으로 바꿔줘</w:t>
+      </w:r>
+    </w:p>
+    <w:p>
+      <w:pPr>
+        <w:spacing w:after="160" w:line="264" w:lineRule="auto"/>
+        <w:ind w:left="170"/>
+        <w:shd w:val="clear" w:color="auto" w:fill="F2F4F5"/>
+      </w:pPr>
+      <w:r>
+        <w:rPr>
+          <w:rFonts w:ascii="Consolas" w:hAnsi="Consolas" w:eastAsia="맑은 고딕"/>
+          <w:sz w:val="18"/>
+        </w:rPr>
+        <w:t>draft.md 참고문헌을 한글 문서용 표로 만들어줘</w:t>
+      </w:r>
+    </w:p>
+    <w:p>
+      <w:r>
+        <w:rPr>
+          <w:rFonts w:ascii="맑은 고딕" w:hAnsi="맑은 고딕" w:eastAsia="맑은 고딕"/>
+          <w:b w:val="0"/>
+        </w:rPr>
+        <w:t>인용 키를 모르면 이렇게 물어봅니다.</w:t>
+      </w:r>
+    </w:p>
+    <w:p>
+      <w:pPr>
+        <w:spacing w:after="0" w:line="264" w:lineRule="auto"/>
+        <w:ind w:left="170"/>
+        <w:shd w:val="clear" w:color="auto" w:fill="F2F4F5"/>
+      </w:pPr>
+      <w:r>
+        <w:rPr>
+          <w:rFonts w:ascii="Consolas" w:hAnsi="Consolas" w:eastAsia="맑은 고딕"/>
+          <w:sz w:val="18"/>
+        </w:rPr>
+        <w:t>SDNN 정확도 다룬 논문 인용 키 알려줘</w:t>
+      </w:r>
+    </w:p>
+    <w:p>
+      <w:pPr>
+        <w:spacing w:after="160" w:line="264" w:lineRule="auto"/>
+        <w:ind w:left="170"/>
+        <w:shd w:val="clear" w:color="auto" w:fill="F2F4F5"/>
+      </w:pPr>
+      <w:r>
+        <w:rPr>
+          <w:rFonts w:ascii="Consolas" w:hAnsi="Consolas" w:eastAsia="맑은 고딕"/>
+          <w:sz w:val="18"/>
+        </w:rPr>
+        <w:t>이 문장에 맞는 출처 라이브러리에서 찾아서 인용 달아줘: "얼굴 영상으로 HRV를 추정할 수 있다"</w:t>
+      </w:r>
+    </w:p>
+    <w:p>
+      <w:pPr>
+        <w:pStyle w:val="Heading3"/>
+      </w:pPr>
+      <w:r>
+        <w:t>결과 형식</w:t>
       </w:r>
     </w:p>
     <w:tbl>
@@ -1224,7 +1339,7 @@
                 <w:color w:val="FFFFFF"/>
                 <w:sz w:val="19"/>
               </w:rPr>
-              <w:t>원고에 쓰는 형식</w:t>
+              <w:t>원고에 적힌 인용</w:t>
             </w:r>
           </w:p>
         </w:tc>
@@ -1244,7 +1359,7 @@
                 <w:color w:val="FFFFFF"/>
                 <w:sz w:val="19"/>
               </w:rPr>
-              <w:t>APA 결과</w:t>
+              <w:t>APA로 달면</w:t>
             </w:r>
           </w:p>
         </w:tc>
@@ -1264,7 +1379,7 @@
                 <w:color w:val="FFFFFF"/>
                 <w:sz w:val="19"/>
               </w:rPr>
-              <w:t>IEEE 결과</w:t>
+              <w:t>IEEE로 달면</w:t>
             </w:r>
           </w:p>
         </w:tc>
@@ -1463,7 +1578,7 @@
           <w:rFonts w:ascii="맑은 고딕" w:hAnsi="맑은 고딕" w:eastAsia="맑은 고딕"/>
           <w:b w:val="0"/>
         </w:rPr>
-        <w:t xml:space="preserve">라이브러리에 없는 키는 </w:t>
+        <w:t xml:space="preserve">라이브러리에 없는 논문을 인용하면 </w:t>
       </w:r>
       <w:r>
         <w:rPr>
@@ -1478,7 +1593,7 @@
           <w:rFonts w:ascii="맑은 고딕" w:hAnsi="맑은 고딕" w:eastAsia="맑은 고딕"/>
           <w:b w:val="0"/>
         </w:rPr>
-        <w:t>로 표시됩니다. 그 논문을 추가하거나 키 오타를 고치면 됩니다.</w:t>
+        <w:t>로 표시되고, Claude가 그 논문을 추가할지 묻습니다.</w:t>
       </w:r>
     </w:p>
     <w:p>
@@ -1490,7 +1605,7 @@
           <w:rFonts w:ascii="맑은 고딕" w:hAnsi="맑은 고딕" w:eastAsia="맑은 고딕"/>
           <w:b w:val="0"/>
         </w:rPr>
-        <w:t xml:space="preserve">원고 원본은 그대로 두고 </w:t>
+        <w:t xml:space="preserve">최종 문서는 </w:t>
       </w:r>
       <w:r>
         <w:rPr>
@@ -1498,14 +1613,67 @@
           <w:color w:val="8A2B2B"/>
           <w:sz w:val="19"/>
         </w:rPr>
-        <w:t>원고_cited.md</w:t>
+        <w:t>Word로 만들어줘</w:t>
       </w:r>
       <w:r>
         <w:rPr>
           <w:rFonts w:ascii="맑은 고딕" w:hAnsi="맑은 고딕" w:eastAsia="맑은 고딕"/>
           <w:b w:val="0"/>
         </w:rPr>
-        <w:t>를 새로 만듭니다. 고칠 때는 원본을 고친 뒤 다시 실행합니다.</w:t>
+        <w:t xml:space="preserve">, </w:t>
+      </w:r>
+      <w:r>
+        <w:rPr>
+          <w:rFonts w:ascii="Consolas" w:hAnsi="Consolas" w:eastAsia="맑은 고딕"/>
+          <w:color w:val="8A2B2B"/>
+          <w:sz w:val="19"/>
+        </w:rPr>
+        <w:t>PDF로 만들어줘</w:t>
+      </w:r>
+      <w:r>
+        <w:rPr>
+          <w:rFonts w:ascii="맑은 고딕" w:hAnsi="맑은 고딕" w:eastAsia="맑은 고딕"/>
+          <w:b w:val="0"/>
+        </w:rPr>
+        <w:t xml:space="preserve">, </w:t>
+      </w:r>
+      <w:r>
+        <w:rPr>
+          <w:rFonts w:ascii="Consolas" w:hAnsi="Consolas" w:eastAsia="맑은 고딕"/>
+          <w:color w:val="8A2B2B"/>
+          <w:sz w:val="19"/>
+        </w:rPr>
+        <w:t>한글(hwpx)로 만들어줘</w:t>
+      </w:r>
+      <w:r>
+        <w:rPr>
+          <w:rFonts w:ascii="맑은 고딕" w:hAnsi="맑은 고딕" w:eastAsia="맑은 고딕"/>
+          <w:b w:val="0"/>
+        </w:rPr>
+        <w:t xml:space="preserve">라고 하면 됩니다. LaTeX를 쓰면 </w:t>
+      </w:r>
+      <w:r>
+        <w:rPr>
+          <w:rFonts w:ascii="Consolas" w:hAnsi="Consolas" w:eastAsia="맑은 고딕"/>
+          <w:color w:val="8A2B2B"/>
+          <w:sz w:val="19"/>
+        </w:rPr>
+        <w:t>~/paper-library/library.bib</w:t>
+      </w:r>
+      <w:r>
+        <w:rPr>
+          <w:rFonts w:ascii="맑은 고딕" w:hAnsi="맑은 고딕" w:eastAsia="맑은 고딕"/>
+          <w:b w:val="0"/>
+        </w:rPr>
+        <w:t>를 그대로 씁니다.</w:t>
+      </w:r>
+    </w:p>
+    <w:p>
+      <w:pPr>
+        <w:pStyle w:val="Heading2"/>
+      </w:pPr>
+      <w:r>
+        <w:t>7. 잘 쓰는 요령</w:t>
       </w:r>
     </w:p>
     <w:p>
@@ -1514,18 +1682,74 @@
       </w:pPr>
       <w:r>
         <w:rPr>
-          <w:rFonts w:ascii="Consolas" w:hAnsi="Consolas" w:eastAsia="맑은 고딕"/>
-          <w:color w:val="8A2B2B"/>
-          <w:sz w:val="19"/>
+          <w:rFonts w:ascii="맑은 고딕" w:hAnsi="맑은 고딕" w:eastAsia="맑은 고딕"/>
+          <w:b/>
         </w:rPr>
-        <w:t>--table</w:t>
+        <w:t>조건을 구체적으로</w:t>
       </w:r>
       <w:r>
         <w:rPr>
           <w:rFonts w:ascii="맑은 고딕" w:hAnsi="맑은 고딕" w:eastAsia="맑은 고딕"/>
           <w:b w:val="0"/>
         </w:rPr>
-        <w:t xml:space="preserve"> 옵션을 쓰면 한글 문서용 참고문헌 표(번호, 저자(연도), 논문·출처, DOI)를 만듭니다.</w:t>
+        <w:t>: "최근 5년", "임상 연구만", "10편", "한국어로" 같은 조건을 붙이면 결과가 좋아집니다.</w:t>
+      </w:r>
+    </w:p>
+    <w:p>
+      <w:pPr>
+        <w:pStyle w:val="ListBullet"/>
+      </w:pPr>
+      <w:r>
+        <w:rPr>
+          <w:rFonts w:ascii="맑은 고딕" w:hAnsi="맑은 고딕" w:eastAsia="맑은 고딕"/>
+          <w:b/>
+        </w:rPr>
+        <w:t>숫자는 출처 확인</w:t>
+      </w:r>
+      <w:r>
+        <w:rPr>
+          <w:rFonts w:ascii="맑은 고딕" w:hAnsi="맑은 고딕" w:eastAsia="맑은 고딕"/>
+          <w:b w:val="0"/>
+        </w:rPr>
+        <w:t>: Claude는 출처에 있는 수치만 쓰고 쪽 번호를 답니다. 중요한 수치는 "이 수치 원문 몇 쪽인지 보여줘"로 확인하세요.</w:t>
+      </w:r>
+    </w:p>
+    <w:p>
+      <w:pPr>
+        <w:pStyle w:val="ListBullet"/>
+      </w:pPr>
+      <w:r>
+        <w:rPr>
+          <w:rFonts w:ascii="맑은 고딕" w:hAnsi="맑은 고딕" w:eastAsia="맑은 고딕"/>
+          <w:b/>
+        </w:rPr>
+        <w:t>요약은 다시 쓸 수 있음</w:t>
+      </w:r>
+      <w:r>
+        <w:rPr>
+          <w:rFonts w:ascii="맑은 고딕" w:hAnsi="맑은 고딕" w:eastAsia="맑은 고딕"/>
+          <w:b w:val="0"/>
+        </w:rPr>
+        <w:t>: "요약을 실무자 관점으로 다시 써줘", "How 부분 수식 포함해서 자세히"처럼 요청하면 요약 노트를 고쳐 줍니다.</w:t>
+      </w:r>
+    </w:p>
+    <w:p>
+      <w:pPr>
+        <w:pStyle w:val="ListBullet"/>
+      </w:pPr>
+      <w:r>
+        <w:rPr>
+          <w:rFonts w:ascii="맑은 고딕" w:hAnsi="맑은 고딕" w:eastAsia="맑은 고딕"/>
+          <w:b/>
+        </w:rPr>
+        <w:t>원고는 인용 키 상태로 관리</w:t>
+      </w:r>
+      <w:r>
+        <w:rPr>
+          <w:rFonts w:ascii="맑은 고딕" w:hAnsi="맑은 고딕" w:eastAsia="맑은 고딕"/>
+          <w:b w:val="0"/>
+        </w:rPr>
+        <w:t>: 글을 고칠 때는 원고를 고치고 "참고문헌 다시 달아줘"라고 하면 번호가 자동으로 다시 매겨집니다.</w:t>
       </w:r>
     </w:p>
     <w:p>
@@ -1533,7 +1757,16 @@
         <w:pStyle w:val="Heading2"/>
       </w:pPr>
       <w:r>
-        <w:t>6. 명령어 정리 (직접 실행할 때)</w:t>
+        <w:t>8. 자주 묻는 질문</w:t>
+      </w:r>
+    </w:p>
+    <w:p>
+      <w:r>
+        <w:rPr>
+          <w:rFonts w:ascii="맑은 고딕" w:hAnsi="맑은 고딕" w:eastAsia="맑은 고딕"/>
+          <w:b/>
+        </w:rPr>
+        <w:t>Q. API 비용이 드나요?</w:t>
       </w:r>
     </w:p>
     <w:p>
@@ -1542,7 +1775,94 @@
           <w:rFonts w:ascii="맑은 고딕" w:hAnsi="맑은 고딕" w:eastAsia="맑은 고딕"/>
           <w:b w:val="0"/>
         </w:rPr>
-        <w:t>평소에는 Claude에게 말로 시키면 되고, 아래 명령을 직접 실행할 필요는 없습니다.</w:t>
+        <w:t>아니요. 무료 공개 API만 쓰고, 요약은 Claude Code 대화 안에서 이루어집니다. Claude Code 사용량은 평소처럼 쓰입니다.</w:t>
+      </w:r>
+    </w:p>
+    <w:p>
+      <w:r>
+        <w:rPr>
+          <w:rFonts w:ascii="맑은 고딕" w:hAnsi="맑은 고딕" w:eastAsia="맑은 고딕"/>
+          <w:b/>
+        </w:rPr>
+        <w:t>Q. 그림이 안 나오거나 잘못 잘렸어요.</w:t>
+      </w:r>
+    </w:p>
+    <w:p>
+      <w:r>
+        <w:rPr>
+          <w:rFonts w:ascii="맑은 고딕" w:hAnsi="맑은 고딕" w:eastAsia="맑은 고딕"/>
+          <w:b w:val="0"/>
+        </w:rPr>
+        <w:t>"이 논문 그림 다시 확인해줘"라고 하세요. 그림 추출은 캡션 기준이라 레이아웃이 특이한 PDF에서는 놓칠 수 있고, Claude가 요약할 때 잘못된 그림은 뺍니다.</w:t>
+      </w:r>
+    </w:p>
+    <w:p>
+      <w:r>
+        <w:rPr>
+          <w:rFonts w:ascii="맑은 고딕" w:hAnsi="맑은 고딕" w:eastAsia="맑은 고딕"/>
+          <w:b/>
+        </w:rPr>
+        <w:t>Q. 라이브러리를 다른 컴퓨터로 옮기려면?</w:t>
+      </w:r>
+    </w:p>
+    <w:p>
+      <w:r>
+        <w:rPr>
+          <w:rFonts w:ascii="Consolas" w:hAnsi="Consolas" w:eastAsia="맑은 고딕"/>
+          <w:color w:val="8A2B2B"/>
+          <w:sz w:val="19"/>
+        </w:rPr>
+        <w:t>paper-library</w:t>
+      </w:r>
+      <w:r>
+        <w:rPr>
+          <w:rFonts w:ascii="맑은 고딕" w:hAnsi="맑은 고딕" w:eastAsia="맑은 고딕"/>
+          <w:b w:val="0"/>
+        </w:rPr>
+        <w:t xml:space="preserve"> 폴더를 통째로 복사하면 됩니다. PDF와 본문이 들어 있으니 공개 저장소에는 올리지 마세요.</w:t>
+      </w:r>
+    </w:p>
+    <w:p>
+      <w:r>
+        <w:rPr>
+          <w:rFonts w:ascii="맑은 고딕" w:hAnsi="맑은 고딕" w:eastAsia="맑은 고딕"/>
+          <w:b/>
+        </w:rPr>
+        <w:t>Q. 스킬을 최신 버전으로 받으려면?</w:t>
+      </w:r>
+    </w:p>
+    <w:p>
+      <w:r>
+        <w:rPr>
+          <w:rFonts w:ascii="Consolas" w:hAnsi="Consolas" w:eastAsia="맑은 고딕"/>
+          <w:color w:val="8A2B2B"/>
+          <w:sz w:val="19"/>
+        </w:rPr>
+        <w:t>paper-summary 스킬 최신 버전으로 업데이트해줘</w:t>
+      </w:r>
+      <w:r>
+        <w:rPr>
+          <w:rFonts w:ascii="맑은 고딕" w:hAnsi="맑은 고딕" w:eastAsia="맑은 고딕"/>
+          <w:b w:val="0"/>
+        </w:rPr>
+        <w:t>라고 말하면 됩니다.</w:t>
+      </w:r>
+    </w:p>
+    <w:p>
+      <w:pPr>
+        <w:pStyle w:val="Heading2"/>
+      </w:pPr>
+      <w:r>
+        <w:t>부록. 직접 실행할 때의 명령</w:t>
+      </w:r>
+    </w:p>
+    <w:p>
+      <w:r>
+        <w:rPr>
+          <w:rFonts w:ascii="맑은 고딕" w:hAnsi="맑은 고딕" w:eastAsia="맑은 고딕"/>
+          <w:b w:val="0"/>
+        </w:rPr>
+        <w:t>평소에는 필요 없습니다. Claude가 아래 명령을 대신 실행합니다.</w:t>
       </w:r>
     </w:p>
     <w:tbl>
@@ -1613,7 +1933,7 @@
                 <w:color w:val="8A2B2B"/>
                 <w:sz w:val="17"/>
               </w:rPr>
-              <w:t>paperlib.py add &lt;입력&gt; [--no-pdf]</w:t>
+              <w:t>paperlib.py add &lt;DOI·arXiv·PDF&gt; [--no-pdf] [--key &lt;키&gt;]</w:t>
             </w:r>
           </w:p>
         </w:tc>
@@ -1631,7 +1951,7 @@
                 <w:b w:val="0"/>
                 <w:sz w:val="19"/>
               </w:rPr>
-              <w:t>논문 등록, 본문·그림 추출</w:t>
+              <w:t>논문 등록, 받은 PDF 붙이기</w:t>
             </w:r>
           </w:p>
         </w:tc>
@@ -1652,7 +1972,7 @@
                 <w:color w:val="8A2B2B"/>
                 <w:sz w:val="17"/>
               </w:rPr>
-              <w:t>paperlib.py add &lt;PDF 경로&gt; [--key &lt;citekey&gt;]</w:t>
+              <w:t>paperlib.py list [--pending]</w:t>
             </w:r>
           </w:p>
         </w:tc>
@@ -1671,45 +1991,7 @@
                 <w:b w:val="0"/>
                 <w:sz w:val="19"/>
               </w:rPr>
-              <w:t>유료 논문에 나중에 받은 PDF 붙이기</w:t>
-            </w:r>
-          </w:p>
-        </w:tc>
-      </w:tr>
-      <w:tr>
-        <w:tc>
-          <w:tcPr>
-            <w:tcW w:type="dxa" w:w="4706"/>
-          </w:tcPr>
-          <w:p>
-            <w:pPr>
-              <w:spacing w:after="0"/>
-            </w:pPr>
-            <w:r>
-              <w:rPr>
-                <w:rFonts w:ascii="Consolas" w:hAnsi="Consolas" w:eastAsia="맑은 고딕"/>
-                <w:color w:val="8A2B2B"/>
-                <w:sz w:val="17"/>
-              </w:rPr>
-              <w:t>paperlib.py list [--pending]</w:t>
-            </w:r>
-          </w:p>
-        </w:tc>
-        <w:tc>
-          <w:tcPr>
-            <w:tcW w:type="dxa" w:w="4706"/>
-          </w:tcPr>
-          <w:p>
-            <w:pPr>
-              <w:spacing w:after="0"/>
-            </w:pPr>
-            <w:r>
-              <w:rPr>
-                <w:rFonts w:ascii="맑은 고딕" w:hAnsi="맑은 고딕" w:eastAsia="맑은 고딕"/>
-                <w:b w:val="0"/>
-                <w:sz w:val="19"/>
-              </w:rPr>
-              <w:t>라이브러리 목록 (</w:t>
+              <w:t>목록 (</w:t>
             </w:r>
             <w:r>
               <w:rPr>
@@ -1734,7 +2016,6 @@
         <w:tc>
           <w:tcPr>
             <w:tcW w:type="dxa" w:w="4706"/>
-            <w:shd w:val="clear" w:color="auto" w:fill="EEF5F4"/>
           </w:tcPr>
           <w:p>
             <w:pPr>
@@ -1753,7 +2034,6 @@
         <w:tc>
           <w:tcPr>
             <w:tcW w:type="dxa" w:w="4706"/>
-            <w:shd w:val="clear" w:color="auto" w:fill="EEF5F4"/>
           </w:tcPr>
           <w:p>
             <w:pPr>
@@ -1774,44 +2054,6 @@
         <w:tc>
           <w:tcPr>
             <w:tcW w:type="dxa" w:w="4706"/>
-          </w:tcPr>
-          <w:p>
-            <w:pPr>
-              <w:spacing w:after="0"/>
-            </w:pPr>
-            <w:r>
-              <w:rPr>
-                <w:rFonts w:ascii="Consolas" w:hAnsi="Consolas" w:eastAsia="맑은 고딕"/>
-                <w:color w:val="8A2B2B"/>
-                <w:sz w:val="17"/>
-              </w:rPr>
-              <w:t>paperlib.py show &lt;citekey&gt;</w:t>
-            </w:r>
-          </w:p>
-        </w:tc>
-        <w:tc>
-          <w:tcPr>
-            <w:tcW w:type="dxa" w:w="4706"/>
-          </w:tcPr>
-          <w:p>
-            <w:pPr>
-              <w:spacing w:after="0"/>
-            </w:pPr>
-            <w:r>
-              <w:rPr>
-                <w:rFonts w:ascii="맑은 고딕" w:hAnsi="맑은 고딕" w:eastAsia="맑은 고딕"/>
-                <w:b w:val="0"/>
-                <w:sz w:val="19"/>
-              </w:rPr>
-              <w:t>서지 정보와 파일 목록</w:t>
-            </w:r>
-          </w:p>
-        </w:tc>
-      </w:tr>
-      <w:tr>
-        <w:tc>
-          <w:tcPr>
-            <w:tcW w:type="dxa" w:w="4706"/>
             <w:shd w:val="clear" w:color="auto" w:fill="EEF5F4"/>
           </w:tcPr>
           <w:p>
@@ -1824,7 +2066,7 @@
                 <w:color w:val="8A2B2B"/>
                 <w:sz w:val="17"/>
               </w:rPr>
-              <w:t>paperlib.py cite &lt;원고.md&gt; [--style apa|ieee] [--table] [-o 결과.md]</w:t>
+              <w:t>paperlib.py cite &lt;원고.md&gt; [--style apa|ieee] [--table]</w:t>
             </w:r>
           </w:p>
         </w:tc>
@@ -1843,7 +2085,7 @@
                 <w:b w:val="0"/>
                 <w:sz w:val="19"/>
               </w:rPr>
-              <w:t>인용 키를 본문 인용으로 바꾸고 참고문헌 생성</w:t>
+              <w:t>인용 키 → 본문 인용 + 참고문헌</w:t>
             </w:r>
           </w:p>
         </w:tc>
@@ -1863,7 +2105,7 @@
                 <w:color w:val="8A2B2B"/>
                 <w:sz w:val="17"/>
               </w:rPr>
-              <w:t>paperlib.py render [citekey]</w:t>
+              <w:t>paperlib.py render [키]</w:t>
             </w:r>
           </w:p>
         </w:tc>
@@ -1881,71 +2123,7 @@
                 <w:b w:val="0"/>
                 <w:sz w:val="19"/>
               </w:rPr>
-              <w:t>요약 노트를 HTML로 만들기</w:t>
-            </w:r>
-          </w:p>
-        </w:tc>
-      </w:tr>
-      <w:tr>
-        <w:tc>
-          <w:tcPr>
-            <w:tcW w:type="dxa" w:w="4706"/>
-            <w:shd w:val="clear" w:color="auto" w:fill="EEF5F4"/>
-          </w:tcPr>
-          <w:p>
-            <w:pPr>
-              <w:spacing w:after="0"/>
-            </w:pPr>
-            <w:r>
-              <w:rPr>
-                <w:rFonts w:ascii="Consolas" w:hAnsi="Consolas" w:eastAsia="맑은 고딕"/>
-                <w:color w:val="8A2B2B"/>
-                <w:sz w:val="17"/>
-              </w:rPr>
-              <w:t>paperlib.py rebuild</w:t>
-            </w:r>
-          </w:p>
-        </w:tc>
-        <w:tc>
-          <w:tcPr>
-            <w:tcW w:type="dxa" w:w="4706"/>
-            <w:shd w:val="clear" w:color="auto" w:fill="EEF5F4"/>
-          </w:tcPr>
-          <w:p>
-            <w:pPr>
-              <w:spacing w:after="0"/>
-            </w:pPr>
-            <w:r>
-              <w:rPr>
-                <w:rFonts w:ascii="Consolas" w:hAnsi="Consolas" w:eastAsia="맑은 고딕"/>
-                <w:color w:val="8A2B2B"/>
-                <w:sz w:val="17"/>
-              </w:rPr>
-              <w:t>library.json</w:t>
-            </w:r>
-            <w:r>
-              <w:rPr>
-                <w:rFonts w:ascii="맑은 고딕" w:hAnsi="맑은 고딕" w:eastAsia="맑은 고딕"/>
-                <w:b w:val="0"/>
-                <w:sz w:val="19"/>
-              </w:rPr>
-              <w:t>·</w:t>
-            </w:r>
-            <w:r>
-              <w:rPr>
-                <w:rFonts w:ascii="Consolas" w:hAnsi="Consolas" w:eastAsia="맑은 고딕"/>
-                <w:color w:val="8A2B2B"/>
-                <w:sz w:val="17"/>
-              </w:rPr>
-              <w:t>library.bib</w:t>
-            </w:r>
-            <w:r>
-              <w:rPr>
-                <w:rFonts w:ascii="맑은 고딕" w:hAnsi="맑은 고딕" w:eastAsia="맑은 고딕"/>
-                <w:b w:val="0"/>
-                <w:sz w:val="19"/>
-              </w:rPr>
-              <w:t xml:space="preserve"> 다시 만들기</w:t>
+              <w:t>요약 노트 → HTML</w:t>
             </w:r>
           </w:p>
         </w:tc>
@@ -1967,406 +2145,6 @@
           <w:sz w:val="19"/>
         </w:rPr>
         <w:t>python ~/.claude/skills/paper-summary/scripts/paperlib.py &lt;명령&gt;</w:t>
-      </w:r>
-      <w:r>
-        <w:rPr>
-          <w:rFonts w:ascii="맑은 고딕" w:hAnsi="맑은 고딕" w:eastAsia="맑은 고딕"/>
-          <w:b w:val="0"/>
-        </w:rPr>
-        <w:t xml:space="preserve"> (macOS·Linux는 </w:t>
-      </w:r>
-      <w:r>
-        <w:rPr>
-          <w:rFonts w:ascii="Consolas" w:hAnsi="Consolas" w:eastAsia="맑은 고딕"/>
-          <w:color w:val="8A2B2B"/>
-          <w:sz w:val="19"/>
-        </w:rPr>
-        <w:t>python3</w:t>
-      </w:r>
-      <w:r>
-        <w:rPr>
-          <w:rFonts w:ascii="맑은 고딕" w:hAnsi="맑은 고딕" w:eastAsia="맑은 고딕"/>
-          <w:b w:val="0"/>
-        </w:rPr>
-        <w:t>)</w:t>
-      </w:r>
-    </w:p>
-    <w:p>
-      <w:pPr>
-        <w:pStyle w:val="Heading2"/>
-      </w:pPr>
-      <w:r>
-        <w:t>7. 라이브러리 구조</w:t>
-      </w:r>
-    </w:p>
-    <w:p>
-      <w:r>
-        <w:rPr>
-          <w:rFonts w:ascii="맑은 고딕" w:hAnsi="맑은 고딕" w:eastAsia="맑은 고딕"/>
-          <w:b w:val="0"/>
-        </w:rPr>
-        <w:t xml:space="preserve">라이브러리 위치는 기본값이 </w:t>
-      </w:r>
-      <w:r>
-        <w:rPr>
-          <w:rFonts w:ascii="Consolas" w:hAnsi="Consolas" w:eastAsia="맑은 고딕"/>
-          <w:color w:val="8A2B2B"/>
-          <w:sz w:val="19"/>
-        </w:rPr>
-        <w:t>~/paper-library</w:t>
-      </w:r>
-      <w:r>
-        <w:rPr>
-          <w:rFonts w:ascii="맑은 고딕" w:hAnsi="맑은 고딕" w:eastAsia="맑은 고딕"/>
-          <w:b w:val="0"/>
-        </w:rPr>
-        <w:t xml:space="preserve">이고, 환경 변수 </w:t>
-      </w:r>
-      <w:r>
-        <w:rPr>
-          <w:rFonts w:ascii="Consolas" w:hAnsi="Consolas" w:eastAsia="맑은 고딕"/>
-          <w:color w:val="8A2B2B"/>
-          <w:sz w:val="19"/>
-        </w:rPr>
-        <w:t>PAPER_LIB</w:t>
-      </w:r>
-      <w:r>
-        <w:rPr>
-          <w:rFonts w:ascii="맑은 고딕" w:hAnsi="맑은 고딕" w:eastAsia="맑은 고딕"/>
-          <w:b w:val="0"/>
-        </w:rPr>
-        <w:t>로 바꿀 수 있습니다.</w:t>
-      </w:r>
-    </w:p>
-    <w:p>
-      <w:pPr>
-        <w:spacing w:after="0" w:line="264" w:lineRule="auto"/>
-        <w:ind w:left="170"/>
-        <w:shd w:val="clear" w:color="auto" w:fill="F2F4F5"/>
-      </w:pPr>
-      <w:r>
-        <w:rPr>
-          <w:rFonts w:ascii="Consolas" w:hAnsi="Consolas" w:eastAsia="맑은 고딕"/>
-          <w:sz w:val="18"/>
-        </w:rPr>
-        <w:t>paper-library/</w:t>
-      </w:r>
-    </w:p>
-    <w:p>
-      <w:pPr>
-        <w:spacing w:after="0" w:line="264" w:lineRule="auto"/>
-        <w:ind w:left="170"/>
-        <w:shd w:val="clear" w:color="auto" w:fill="F2F4F5"/>
-      </w:pPr>
-      <w:r>
-        <w:rPr>
-          <w:rFonts w:ascii="Consolas" w:hAnsi="Consolas" w:eastAsia="맑은 고딕"/>
-          <w:sz w:val="18"/>
-        </w:rPr>
-        <w:t xml:space="preserve">  index.html      라이브러리 목록 페이지</w:t>
-      </w:r>
-    </w:p>
-    <w:p>
-      <w:pPr>
-        <w:spacing w:after="0" w:line="264" w:lineRule="auto"/>
-        <w:ind w:left="170"/>
-        <w:shd w:val="clear" w:color="auto" w:fill="F2F4F5"/>
-      </w:pPr>
-      <w:r>
-        <w:rPr>
-          <w:rFonts w:ascii="Consolas" w:hAnsi="Consolas" w:eastAsia="맑은 고딕"/>
-          <w:sz w:val="18"/>
-        </w:rPr>
-        <w:t xml:space="preserve">  library.json    목록 데이터</w:t>
-      </w:r>
-    </w:p>
-    <w:p>
-      <w:pPr>
-        <w:spacing w:after="0" w:line="264" w:lineRule="auto"/>
-        <w:ind w:left="170"/>
-        <w:shd w:val="clear" w:color="auto" w:fill="F2F4F5"/>
-      </w:pPr>
-      <w:r>
-        <w:rPr>
-          <w:rFonts w:ascii="Consolas" w:hAnsi="Consolas" w:eastAsia="맑은 고딕"/>
-          <w:sz w:val="18"/>
-        </w:rPr>
-        <w:t xml:space="preserve">  library.bib     BibTeX (LaTeX·다른 도구에서 그대로 사용 가능)</w:t>
-      </w:r>
-    </w:p>
-    <w:p>
-      <w:pPr>
-        <w:spacing w:after="0" w:line="264" w:lineRule="auto"/>
-        <w:ind w:left="170"/>
-        <w:shd w:val="clear" w:color="auto" w:fill="F2F4F5"/>
-      </w:pPr>
-      <w:r>
-        <w:rPr>
-          <w:rFonts w:ascii="Consolas" w:hAnsi="Consolas" w:eastAsia="맑은 고딕"/>
-          <w:sz w:val="18"/>
-        </w:rPr>
-        <w:t xml:space="preserve">  papers/&lt;citekey&gt;/</w:t>
-      </w:r>
-    </w:p>
-    <w:p>
-      <w:pPr>
-        <w:spacing w:after="0" w:line="264" w:lineRule="auto"/>
-        <w:ind w:left="170"/>
-        <w:shd w:val="clear" w:color="auto" w:fill="F2F4F5"/>
-      </w:pPr>
-      <w:r>
-        <w:rPr>
-          <w:rFonts w:ascii="Consolas" w:hAnsi="Consolas" w:eastAsia="맑은 고딕"/>
-          <w:sz w:val="18"/>
-        </w:rPr>
-        <w:t xml:space="preserve">    meta.json     서지 정보</w:t>
-      </w:r>
-    </w:p>
-    <w:p>
-      <w:pPr>
-        <w:spacing w:after="0" w:line="264" w:lineRule="auto"/>
-        <w:ind w:left="170"/>
-        <w:shd w:val="clear" w:color="auto" w:fill="F2F4F5"/>
-      </w:pPr>
-      <w:r>
-        <w:rPr>
-          <w:rFonts w:ascii="Consolas" w:hAnsi="Consolas" w:eastAsia="맑은 고딕"/>
-          <w:sz w:val="18"/>
-        </w:rPr>
-        <w:t xml:space="preserve">    paper.pdf     원문 (--no-pdf면 없음)</w:t>
-      </w:r>
-    </w:p>
-    <w:p>
-      <w:pPr>
-        <w:spacing w:after="0" w:line="264" w:lineRule="auto"/>
-        <w:ind w:left="170"/>
-        <w:shd w:val="clear" w:color="auto" w:fill="F2F4F5"/>
-      </w:pPr>
-      <w:r>
-        <w:rPr>
-          <w:rFonts w:ascii="Consolas" w:hAnsi="Consolas" w:eastAsia="맑은 고딕"/>
-          <w:sz w:val="18"/>
-        </w:rPr>
-        <w:t xml:space="preserve">    text.md       &lt;!-- page N --&gt; 쪽 표시가 달린 본문</w:t>
-      </w:r>
-    </w:p>
-    <w:p>
-      <w:pPr>
-        <w:spacing w:after="0" w:line="264" w:lineRule="auto"/>
-        <w:ind w:left="170"/>
-        <w:shd w:val="clear" w:color="auto" w:fill="F2F4F5"/>
-      </w:pPr>
-      <w:r>
-        <w:rPr>
-          <w:rFonts w:ascii="Consolas" w:hAnsi="Consolas" w:eastAsia="맑은 고딕"/>
-          <w:sz w:val="18"/>
-        </w:rPr>
-        <w:t xml:space="preserve">    figures/      fig1.jpg …  + figures.json (번호·쪽·캡션)</w:t>
-      </w:r>
-    </w:p>
-    <w:p>
-      <w:pPr>
-        <w:spacing w:after="0" w:line="264" w:lineRule="auto"/>
-        <w:ind w:left="170"/>
-        <w:shd w:val="clear" w:color="auto" w:fill="F2F4F5"/>
-      </w:pPr>
-      <w:r>
-        <w:rPr>
-          <w:rFonts w:ascii="Consolas" w:hAnsi="Consolas" w:eastAsia="맑은 고딕"/>
-          <w:sz w:val="18"/>
-        </w:rPr>
-        <w:t xml:space="preserve">    summary.md    요약 노트 (문장마다 [@키, p. N])</w:t>
-      </w:r>
-    </w:p>
-    <w:p>
-      <w:pPr>
-        <w:spacing w:after="160" w:line="264" w:lineRule="auto"/>
-        <w:ind w:left="170"/>
-        <w:shd w:val="clear" w:color="auto" w:fill="F2F4F5"/>
-      </w:pPr>
-      <w:r>
-        <w:rPr>
-          <w:rFonts w:ascii="Consolas" w:hAnsi="Consolas" w:eastAsia="맑은 고딕"/>
-          <w:sz w:val="18"/>
-        </w:rPr>
-        <w:t xml:space="preserve">    index.html    보기용 페이지</w:t>
-      </w:r>
-    </w:p>
-    <w:p>
-      <w:pPr>
-        <w:pStyle w:val="ListBullet"/>
-      </w:pPr>
-      <w:r>
-        <w:rPr>
-          <w:rFonts w:ascii="맑은 고딕" w:hAnsi="맑은 고딕" w:eastAsia="맑은 고딕"/>
-          <w:b w:val="0"/>
-        </w:rPr>
-        <w:t xml:space="preserve">citekey는 </w:t>
-      </w:r>
-      <w:r>
-        <w:rPr>
-          <w:rFonts w:ascii="Consolas" w:hAnsi="Consolas" w:eastAsia="맑은 고딕"/>
-          <w:color w:val="8A2B2B"/>
-          <w:sz w:val="19"/>
-        </w:rPr>
-        <w:t>제1저자 성 + 연도 + 제목 첫 단어</w:t>
-      </w:r>
-      <w:r>
-        <w:rPr>
-          <w:rFonts w:ascii="맑은 고딕" w:hAnsi="맑은 고딕" w:eastAsia="맑은 고딕"/>
-          <w:b w:val="0"/>
-        </w:rPr>
-        <w:t xml:space="preserve"> 형식입니다. 예: </w:t>
-      </w:r>
-      <w:r>
-        <w:rPr>
-          <w:rFonts w:ascii="Consolas" w:hAnsi="Consolas" w:eastAsia="맑은 고딕"/>
-          <w:color w:val="8A2B2B"/>
-          <w:sz w:val="19"/>
-        </w:rPr>
-        <w:t>Pstras2026estimating</w:t>
-      </w:r>
-    </w:p>
-    <w:p>
-      <w:pPr>
-        <w:pStyle w:val="ListBullet"/>
-      </w:pPr>
-      <w:r>
-        <w:rPr>
-          <w:rFonts w:ascii="맑은 고딕" w:hAnsi="맑은 고딕" w:eastAsia="맑은 고딕"/>
-          <w:b w:val="0"/>
-        </w:rPr>
-        <w:t>같은 DOI나 arXiv 번호를 다시 추가하면 새로 만들지 않고 기존 폴더를 갱신합니다.</w:t>
-      </w:r>
-    </w:p>
-    <w:p>
-      <w:pPr>
-        <w:pStyle w:val="Heading2"/>
-      </w:pPr>
-      <w:r>
-        <w:t>8. 자주 묻는 질문</w:t>
-      </w:r>
-    </w:p>
-    <w:p>
-      <w:r>
-        <w:rPr>
-          <w:rFonts w:ascii="맑은 고딕" w:hAnsi="맑은 고딕" w:eastAsia="맑은 고딕"/>
-          <w:b/>
-        </w:rPr>
-        <w:t>Q. API 비용이 드나요?</w:t>
-      </w:r>
-    </w:p>
-    <w:p>
-      <w:r>
-        <w:rPr>
-          <w:rFonts w:ascii="맑은 고딕" w:hAnsi="맑은 고딕" w:eastAsia="맑은 고딕"/>
-          <w:b w:val="0"/>
-        </w:rPr>
-        <w:t>아니요. 스크립트는 키가 필요 없는 무료 공개 API만 부르고, 요약은 Claude Code 대화 안에서 이루어집니다. 다만 Claude Code 자체의 사용량은 평소처럼 쓰입니다.</w:t>
-      </w:r>
-    </w:p>
-    <w:p>
-      <w:r>
-        <w:rPr>
-          <w:rFonts w:ascii="맑은 고딕" w:hAnsi="맑은 고딕" w:eastAsia="맑은 고딕"/>
-          <w:b/>
-        </w:rPr>
-        <w:t>Q. 그림이 안 나오거나 잘못 잘렸어요.</w:t>
-      </w:r>
-    </w:p>
-    <w:p>
-      <w:r>
-        <w:rPr>
-          <w:rFonts w:ascii="맑은 고딕" w:hAnsi="맑은 고딕" w:eastAsia="맑은 고딕"/>
-          <w:b w:val="0"/>
-        </w:rPr>
-        <w:t>그림 추출은 「Figure N:」「Fig. N」 캡션을 기준으로 합니다. 레이아웃이 특이한 PDF에서는 일부 그림을 놓칠 수 있습니다. Claude가 요약할 때 그림을 확인하고 잘못된 그림은 요약에서 뺍니다.</w:t>
-      </w:r>
-    </w:p>
-    <w:p>
-      <w:r>
-        <w:rPr>
-          <w:rFonts w:ascii="맑은 고딕" w:hAnsi="맑은 고딕" w:eastAsia="맑은 고딕"/>
-          <w:b/>
-        </w:rPr>
-        <w:t>Q. 라이브러리를 다른 컴퓨터로 옮기거나 공유할 수 있나요?</w:t>
-      </w:r>
-    </w:p>
-    <w:p>
-      <w:r>
-        <w:rPr>
-          <w:rFonts w:ascii="Consolas" w:hAnsi="Consolas" w:eastAsia="맑은 고딕"/>
-          <w:color w:val="8A2B2B"/>
-          <w:sz w:val="19"/>
-        </w:rPr>
-        <w:t>paper-library</w:t>
-      </w:r>
-      <w:r>
-        <w:rPr>
-          <w:rFonts w:ascii="맑은 고딕" w:hAnsi="맑은 고딕" w:eastAsia="맑은 고딕"/>
-          <w:b w:val="0"/>
-        </w:rPr>
-        <w:t xml:space="preserve"> 폴더를 통째로 복사하면 됩니다. 다만 PDF와 본문이 들어 있으니 공개 저장소에는 올리지 마세요.</w:t>
-      </w:r>
-    </w:p>
-    <w:p>
-      <w:r>
-        <w:rPr>
-          <w:rFonts w:ascii="맑은 고딕" w:hAnsi="맑은 고딕" w:eastAsia="맑은 고딕"/>
-          <w:b/>
-        </w:rPr>
-        <w:t>Q. 스킬을 최신 버전으로 받으려면?</w:t>
-      </w:r>
-    </w:p>
-    <w:p>
-      <w:r>
-        <w:rPr>
-          <w:rFonts w:ascii="Consolas" w:hAnsi="Consolas" w:eastAsia="맑은 고딕"/>
-          <w:color w:val="8A2B2B"/>
-          <w:sz w:val="19"/>
-        </w:rPr>
-        <w:t>git -C ~/.claude/skills/paper-summary pull</w:t>
-      </w:r>
-    </w:p>
-    <w:p>
-      <w:r>
-        <w:rPr>
-          <w:rFonts w:ascii="맑은 고딕" w:hAnsi="맑은 고딕" w:eastAsia="맑은 고딕"/>
-          <w:b/>
-        </w:rPr>
-        <w:t>Q. LaTeX로 쓰는데 쓸 수 있나요?</w:t>
-      </w:r>
-    </w:p>
-    <w:p>
-      <w:r>
-        <w:rPr>
-          <w:rFonts w:ascii="Consolas" w:hAnsi="Consolas" w:eastAsia="맑은 고딕"/>
-          <w:color w:val="8A2B2B"/>
-          <w:sz w:val="19"/>
-        </w:rPr>
-        <w:t>library.bib</w:t>
-      </w:r>
-      <w:r>
-        <w:rPr>
-          <w:rFonts w:ascii="맑은 고딕" w:hAnsi="맑은 고딕" w:eastAsia="맑은 고딕"/>
-          <w:b w:val="0"/>
-        </w:rPr>
-        <w:t xml:space="preserve">를 그대로 쓰면 됩니다. citekey가 같아서 </w:t>
-      </w:r>
-      <w:r>
-        <w:rPr>
-          <w:rFonts w:ascii="Consolas" w:hAnsi="Consolas" w:eastAsia="맑은 고딕"/>
-          <w:color w:val="8A2B2B"/>
-          <w:sz w:val="19"/>
-        </w:rPr>
-        <w:t>\cite{Pstras2026estimating}</w:t>
-      </w:r>
-      <w:r>
-        <w:rPr>
-          <w:rFonts w:ascii="맑은 고딕" w:hAnsi="맑은 고딕" w:eastAsia="맑은 고딕"/>
-          <w:b w:val="0"/>
-        </w:rPr>
-        <w:t>로 인용할 수 있습니다.</w:t>
       </w:r>
     </w:p>
     <w:sectPr>

</xml_diff>

<commit_message>
Fix Windows install docs and support newer PyMuPDF
- README: PowerShell versions of the verify and update commands
  (PowerShell does not expand ~), and a "let Claude install it" option
- usage guide appendix: per-OS command path; docx/pdf regenerated
- paperlib: import pymupdf first, fall back to fitz for older versions

Co-Authored-By: Claude Opus 5.5 <noreply@anthropic.com>
</commit_message>
<xml_diff>
--- a/docs/paper-summary_사용가이드.docx
+++ b/docs/paper-summary_사용가이드.docx
@@ -2136,7 +2136,7 @@
           <w:rFonts w:ascii="맑은 고딕" w:hAnsi="맑은 고딕" w:eastAsia="맑은 고딕"/>
           <w:b w:val="0"/>
         </w:rPr>
-        <w:t xml:space="preserve">실행 위치: </w:t>
+        <w:t xml:space="preserve">실행 위치: Windows PowerShell은 </w:t>
       </w:r>
       <w:r>
         <w:rPr>
@@ -2144,7 +2144,22 @@
           <w:color w:val="8A2B2B"/>
           <w:sz w:val="19"/>
         </w:rPr>
-        <w:t>python ~/.claude/skills/paper-summary/scripts/paperlib.py &lt;명령&gt;</w:t>
+        <w:t>python "$HOME\.claude\skills\paper-summary\scripts\paperlib.py" &lt;명령&gt;</w:t>
+      </w:r>
+      <w:r>
+        <w:rPr>
+          <w:rFonts w:ascii="맑은 고딕" w:hAnsi="맑은 고딕" w:eastAsia="맑은 고딕"/>
+          <w:b w:val="0"/>
+        </w:rPr>
+        <w:t xml:space="preserve">, macOS·Linux는 </w:t>
+      </w:r>
+      <w:r>
+        <w:rPr>
+          <w:rFonts w:ascii="Consolas" w:hAnsi="Consolas" w:eastAsia="맑은 고딕"/>
+          <w:color w:val="8A2B2B"/>
+          <w:sz w:val="19"/>
+        </w:rPr>
+        <w:t>python3 ~/.claude/skills/paper-summary/scripts/paperlib.py &lt;명령&gt;</w:t>
       </w:r>
     </w:p>
     <w:sectPr>

</xml_diff>

<commit_message>
Support policy reports and web pages
- add <web URL> saves page text, title, site, date and access date
- PDFs without a DOI default to reports; set fills issuing body,
  year, report number, publisher and URL; rename changes a citekey
- organization and Korean author names are kept as written;
  citekeys can contain Korean (e.g. STEPI2025인공지능)
- APA/IEEE/BibTeX formats for reports, books and web pages;
  Korean figure captions (<그림 2-1>) are extracted
- SKILL.md adds a web-search step for government, think-tank and
  international-organization sources; README and guide updated

Co-Authored-By: Claude Opus 5.5 <noreply@anthropic.com>
</commit_message>
<xml_diff>
--- a/docs/paper-summary_사용가이드.docx
+++ b/docs/paper-summary_사용가이드.docx
@@ -16,7 +16,7 @@
           <w:rFonts w:ascii="맑은 고딕" w:hAnsi="맑은 고딕" w:eastAsia="맑은 고딕"/>
           <w:b w:val="0"/>
         </w:rPr>
-        <w:t>Claude Code에서 자연어로 말하기만 하면, 논문을 찾고 요약해 쌓아 두었다가 글을 쓸 때 참고문헌까지 자동으로 달아 주는 스킬입니다. 명령어를 외울 필요가 없습니다.</w:t>
+        <w:t>Claude Code에서 자연어로 말하기만 하면, 논문·정책 보고서·웹 자료를 찾고 요약해 쌓아 두었다가 글을 쓸 때 참고문헌까지 자동으로 달아 주는 스킬입니다. 명령어를 외울 필요가 없습니다.</w:t>
       </w:r>
     </w:p>
     <w:p>
@@ -216,6 +216,84 @@
                 <w:sz w:val="17"/>
               </w:rPr>
               <w:t>C:\Downloads\paper.pdf 논문 요약해줘</w:t>
+            </w:r>
+          </w:p>
+        </w:tc>
+      </w:tr>
+      <w:tr>
+        <w:tc>
+          <w:tcPr>
+            <w:tcW w:type="dxa" w:w="4706"/>
+            <w:shd w:val="clear" w:color="auto" w:fill="EEF5F4"/>
+          </w:tcPr>
+          <w:p>
+            <w:pPr>
+              <w:spacing w:after="0"/>
+            </w:pPr>
+            <w:r>
+              <w:rPr>
+                <w:rFonts w:ascii="맑은 고딕" w:hAnsi="맑은 고딕" w:eastAsia="맑은 고딕"/>
+                <w:b w:val="0"/>
+                <w:sz w:val="19"/>
+              </w:rPr>
+              <w:t>정책 자료 조사</w:t>
+            </w:r>
+          </w:p>
+        </w:tc>
+        <w:tc>
+          <w:tcPr>
+            <w:tcW w:type="dxa" w:w="4706"/>
+            <w:shd w:val="clear" w:color="auto" w:fill="EEF5F4"/>
+          </w:tcPr>
+          <w:p>
+            <w:pPr>
+              <w:spacing w:after="0"/>
+            </w:pPr>
+            <w:r>
+              <w:rPr>
+                <w:rFonts w:ascii="Consolas" w:hAnsi="Consolas" w:eastAsia="맑은 고딕"/>
+                <w:color w:val="8A2B2B"/>
+                <w:sz w:val="17"/>
+              </w:rPr>
+              <w:t>/paper-summary AI 인재정책 관련 국내외 정책 보고서와 논문 조사해줘</w:t>
+            </w:r>
+          </w:p>
+        </w:tc>
+      </w:tr>
+      <w:tr>
+        <w:tc>
+          <w:tcPr>
+            <w:tcW w:type="dxa" w:w="4706"/>
+          </w:tcPr>
+          <w:p>
+            <w:pPr>
+              <w:spacing w:after="0"/>
+            </w:pPr>
+            <w:r>
+              <w:rPr>
+                <w:rFonts w:ascii="맑은 고딕" w:hAnsi="맑은 고딕" w:eastAsia="맑은 고딕"/>
+                <w:b w:val="0"/>
+                <w:sz w:val="19"/>
+              </w:rPr>
+              <w:t>보고서·보도자료 저장</w:t>
+            </w:r>
+          </w:p>
+        </w:tc>
+        <w:tc>
+          <w:tcPr>
+            <w:tcW w:type="dxa" w:w="4706"/>
+          </w:tcPr>
+          <w:p>
+            <w:pPr>
+              <w:spacing w:after="0"/>
+            </w:pPr>
+            <w:r>
+              <w:rPr>
+                <w:rFonts w:ascii="Consolas" w:hAnsi="Consolas" w:eastAsia="맑은 고딕"/>
+                <w:color w:val="8A2B2B"/>
+                <w:sz w:val="17"/>
+              </w:rPr>
+              <w:t>이 보고서 정리해줘: &lt;PDF 경로 또는 URL&gt;</w:t>
             </w:r>
           </w:p>
         </w:tc>
@@ -977,7 +1055,603 @@
         <w:pStyle w:val="Heading2"/>
       </w:pPr>
       <w:r>
-        <w:t>5. 저장한 논문 찾고 보기</w:t>
+        <w:t>5. 정책 자료·보고서·웹 자료</w:t>
+      </w:r>
+    </w:p>
+    <w:p>
+      <w:r>
+        <w:rPr>
+          <w:rFonts w:ascii="맑은 고딕" w:hAnsi="맑은 고딕" w:eastAsia="맑은 고딕"/>
+          <w:b w:val="0"/>
+        </w:rPr>
+        <w:t>논문뿐 아니라 국책연구기관 보고서, 정부 보도자료, 국제기구 보고서도 같은 방식으로 저장하고 인용할 수 있습니다.</w:t>
+      </w:r>
+    </w:p>
+    <w:p>
+      <w:pPr>
+        <w:pStyle w:val="Heading3"/>
+      </w:pPr>
+      <w:r>
+        <w:t>정책 주제 조사</w:t>
+      </w:r>
+    </w:p>
+    <w:p>
+      <w:pPr>
+        <w:spacing w:after="0" w:line="264" w:lineRule="auto"/>
+        <w:ind w:left="170"/>
+        <w:shd w:val="clear" w:color="auto" w:fill="F2F4F5"/>
+      </w:pPr>
+      <w:r>
+        <w:rPr>
+          <w:rFonts w:ascii="Consolas" w:hAnsi="Consolas" w:eastAsia="맑은 고딕"/>
+          <w:sz w:val="18"/>
+        </w:rPr>
+        <w:t>/paper-summary AI 인재정책 관련 국내외 정책 보고서와 논문 조사해줘</w:t>
+      </w:r>
+    </w:p>
+    <w:p>
+      <w:pPr>
+        <w:spacing w:after="0" w:line="264" w:lineRule="auto"/>
+        <w:ind w:left="170"/>
+        <w:shd w:val="clear" w:color="auto" w:fill="F2F4F5"/>
+      </w:pPr>
+      <w:r>
+        <w:rPr>
+          <w:rFonts w:ascii="Consolas" w:hAnsi="Consolas" w:eastAsia="맑은 고딕"/>
+          <w:sz w:val="18"/>
+        </w:rPr>
+        <w:t>/paper-summary 탄소중립 R&amp;D 예산 정책, KISTEP·STEPI·OECD 보고서 위주로 찾아줘</w:t>
+      </w:r>
+    </w:p>
+    <w:p>
+      <w:pPr>
+        <w:spacing w:after="160" w:line="264" w:lineRule="auto"/>
+        <w:ind w:left="170"/>
+        <w:shd w:val="clear" w:color="auto" w:fill="F2F4F5"/>
+      </w:pPr>
+      <w:r>
+        <w:rPr>
+          <w:rFonts w:ascii="Consolas" w:hAnsi="Consolas" w:eastAsia="맑은 고딕"/>
+          <w:sz w:val="18"/>
+        </w:rPr>
+        <w:t>최근 2년 과기정통부 AI 관련 보도자료 정리해줘</w:t>
+      </w:r>
+    </w:p>
+    <w:p>
+      <w:r>
+        <w:rPr>
+          <w:rFonts w:ascii="맑은 고딕" w:hAnsi="맑은 고딕" w:eastAsia="맑은 고딕"/>
+          <w:b w:val="0"/>
+        </w:rPr>
+        <w:t>Claude가 하는 일: 학술 논문 검색과 함께 웹 검색으로 국책연구기관(KDI, STEPI, KISTEP, 국회입법조사처 등), 정부 부처·정책브리핑, 국제기구(OECD, World Bank 등) 자료를 찾습니다. 언론 기사나 재게시 페이지는 원문을 찾는 데만 쓰고, 인용은 원 발행 기관 자료로 합니다.</w:t>
+      </w:r>
+    </w:p>
+    <w:p>
+      <w:pPr>
+        <w:pStyle w:val="Heading3"/>
+      </w:pPr>
+      <w:r>
+        <w:t>보고서·웹페이지 저장</w:t>
+      </w:r>
+    </w:p>
+    <w:p>
+      <w:pPr>
+        <w:spacing w:after="0" w:line="264" w:lineRule="auto"/>
+        <w:ind w:left="170"/>
+        <w:shd w:val="clear" w:color="auto" w:fill="F2F4F5"/>
+      </w:pPr>
+      <w:r>
+        <w:rPr>
+          <w:rFonts w:ascii="Consolas" w:hAnsi="Consolas" w:eastAsia="맑은 고딕"/>
+          <w:sz w:val="18"/>
+        </w:rPr>
+        <w:t>이 보고서 정리해줘: C:\Downloads\stepi_report.pdf</w:t>
+      </w:r>
+    </w:p>
+    <w:p>
+      <w:pPr>
+        <w:spacing w:after="0" w:line="264" w:lineRule="auto"/>
+        <w:ind w:left="170"/>
+        <w:shd w:val="clear" w:color="auto" w:fill="F2F4F5"/>
+      </w:pPr>
+      <w:r>
+        <w:rPr>
+          <w:rFonts w:ascii="Consolas" w:hAnsi="Consolas" w:eastAsia="맑은 고딕"/>
+          <w:sz w:val="18"/>
+        </w:rPr>
+        <w:t>이 보고서 라이브러리에 넣어줘: https://…/report.pdf</w:t>
+      </w:r>
+    </w:p>
+    <w:p>
+      <w:pPr>
+        <w:spacing w:after="160" w:line="264" w:lineRule="auto"/>
+        <w:ind w:left="170"/>
+        <w:shd w:val="clear" w:color="auto" w:fill="F2F4F5"/>
+      </w:pPr>
+      <w:r>
+        <w:rPr>
+          <w:rFonts w:ascii="Consolas" w:hAnsi="Consolas" w:eastAsia="맑은 고딕"/>
+          <w:sz w:val="18"/>
+        </w:rPr>
+        <w:t>이 보도자료 정리해줘: https://www.korea.kr/briefing/…</w:t>
+      </w:r>
+    </w:p>
+    <w:p>
+      <w:pPr>
+        <w:ind w:left="357" w:hanging="357"/>
+      </w:pPr>
+      <w:r>
+        <w:rPr>
+          <w:rFonts w:ascii="맑은 고딕" w:hAnsi="맑은 고딕" w:eastAsia="맑은 고딕"/>
+          <w:b/>
+          <w:color w:val="0B5C5A"/>
+        </w:rPr>
+        <w:t>1.</w:t>
+        <w:tab/>
+      </w:r>
+      <w:r>
+        <w:rPr>
+          <w:rFonts w:ascii="맑은 고딕" w:hAnsi="맑은 고딕" w:eastAsia="맑은 고딕"/>
+          <w:b w:val="0"/>
+        </w:rPr>
+        <w:t>PDF는 본문과 그림(「Figure N」, 「&lt;그림 2-1&gt;」 캡션)을 저장하고, 웹페이지는 본문 텍스트와 접속일을 저장합니다.</w:t>
+      </w:r>
+    </w:p>
+    <w:p>
+      <w:pPr>
+        <w:ind w:left="357" w:hanging="357"/>
+      </w:pPr>
+      <w:r>
+        <w:rPr>
+          <w:rFonts w:ascii="맑은 고딕" w:hAnsi="맑은 고딕" w:eastAsia="맑은 고딕"/>
+          <w:b/>
+          <w:color w:val="0B5C5A"/>
+        </w:rPr>
+        <w:t>2.</w:t>
+        <w:tab/>
+      </w:r>
+      <w:r>
+        <w:rPr>
+          <w:rFonts w:ascii="맑은 고딕" w:hAnsi="맑은 고딕" w:eastAsia="맑은 고딕"/>
+          <w:b w:val="0"/>
+        </w:rPr>
+        <w:t>DOI가 없는 보고서는 서지 정보가 비어 있어서, Claude가 표지·판권면을 읽고 발행 기관, 연도, 보고서 번호, URL을 채웁니다.</w:t>
+      </w:r>
+    </w:p>
+    <w:p>
+      <w:pPr>
+        <w:ind w:left="357" w:hanging="357"/>
+      </w:pPr>
+      <w:r>
+        <w:rPr>
+          <w:rFonts w:ascii="맑은 고딕" w:hAnsi="맑은 고딕" w:eastAsia="맑은 고딕"/>
+          <w:b/>
+          <w:color w:val="0B5C5A"/>
+        </w:rPr>
+        <w:t>3.</w:t>
+        <w:tab/>
+      </w:r>
+      <w:r>
+        <w:rPr>
+          <w:rFonts w:ascii="맑은 고딕" w:hAnsi="맑은 고딕" w:eastAsia="맑은 고딕"/>
+          <w:b w:val="0"/>
+        </w:rPr>
+        <w:t xml:space="preserve">인용 키는 </w:t>
+      </w:r>
+      <w:r>
+        <w:rPr>
+          <w:rFonts w:ascii="Consolas" w:hAnsi="Consolas" w:eastAsia="맑은 고딕"/>
+          <w:color w:val="8A2B2B"/>
+          <w:sz w:val="19"/>
+        </w:rPr>
+        <w:t>STEPI2025인공지능</w:t>
+      </w:r>
+      <w:r>
+        <w:rPr>
+          <w:rFonts w:ascii="맑은 고딕" w:hAnsi="맑은 고딕" w:eastAsia="맑은 고딕"/>
+          <w:b w:val="0"/>
+        </w:rPr>
+        <w:t>처럼 기관 약칭, 연도, 핵심어로 붙입니다.</w:t>
+      </w:r>
+    </w:p>
+    <w:p>
+      <w:pPr>
+        <w:ind w:left="357" w:hanging="357"/>
+      </w:pPr>
+      <w:r>
+        <w:rPr>
+          <w:rFonts w:ascii="맑은 고딕" w:hAnsi="맑은 고딕" w:eastAsia="맑은 고딕"/>
+          <w:b/>
+          <w:color w:val="0B5C5A"/>
+        </w:rPr>
+        <w:t>4.</w:t>
+        <w:tab/>
+      </w:r>
+      <w:r>
+        <w:rPr>
+          <w:rFonts w:ascii="맑은 고딕" w:hAnsi="맑은 고딕" w:eastAsia="맑은 고딕"/>
+          <w:b w:val="0"/>
+        </w:rPr>
+        <w:t>보고서 요약은 정책 배경, 목표, 주요 과제, 추진 체계, 예산, 시사점 중심으로 씁니다.</w:t>
+      </w:r>
+    </w:p>
+    <w:p>
+      <w:r>
+        <w:rPr>
+          <w:rFonts w:ascii="맑은 고딕" w:hAnsi="맑은 고딕" w:eastAsia="맑은 고딕"/>
+          <w:b w:val="0"/>
+        </w:rPr>
+        <w:t>서지가 틀리면 말로 고칩니다.</w:t>
+      </w:r>
+    </w:p>
+    <w:p>
+      <w:pPr>
+        <w:spacing w:after="0" w:line="264" w:lineRule="auto"/>
+        <w:ind w:left="170"/>
+        <w:shd w:val="clear" w:color="auto" w:fill="F2F4F5"/>
+      </w:pPr>
+      <w:r>
+        <w:rPr>
+          <w:rFonts w:ascii="Consolas" w:hAnsi="Consolas" w:eastAsia="맑은 고딕"/>
+          <w:sz w:val="18"/>
+        </w:rPr>
+        <w:t>STEPI2025인공지능 보고서 번호를 정책연구 2025-07로 고쳐줘</w:t>
+      </w:r>
+    </w:p>
+    <w:p>
+      <w:pPr>
+        <w:spacing w:after="0" w:line="264" w:lineRule="auto"/>
+        <w:ind w:left="170"/>
+        <w:shd w:val="clear" w:color="auto" w:fill="F2F4F5"/>
+      </w:pPr>
+      <w:r>
+        <w:rPr>
+          <w:rFonts w:ascii="Consolas" w:hAnsi="Consolas" w:eastAsia="맑은 고딕"/>
+          <w:sz w:val="18"/>
+        </w:rPr>
+        <w:t>이 보도자료 발행 기관을 과학기술정보통신부로, 게시일을 2025-12-03으로 해줘</w:t>
+      </w:r>
+    </w:p>
+    <w:p>
+      <w:pPr>
+        <w:spacing w:after="160" w:line="264" w:lineRule="auto"/>
+        <w:ind w:left="170"/>
+        <w:shd w:val="clear" w:color="auto" w:fill="F2F4F5"/>
+      </w:pPr>
+      <w:r>
+        <w:rPr>
+          <w:rFonts w:ascii="Consolas" w:hAnsi="Consolas" w:eastAsia="맑은 고딕"/>
+          <w:sz w:val="18"/>
+        </w:rPr>
+        <w:t>인용 키를 KISTEP2025예산으로 바꿔줘</w:t>
+      </w:r>
+    </w:p>
+    <w:p>
+      <w:pPr>
+        <w:pStyle w:val="Heading3"/>
+      </w:pPr>
+      <w:r>
+        <w:t>보고서 인용 결과 예</w:t>
+      </w:r>
+    </w:p>
+    <w:tbl>
+      <w:tblPr>
+        <w:tblStyle w:val="TableGrid"/>
+        <w:tblW w:type="auto" w:w="0"/>
+        <w:jc w:val="center"/>
+        <w:tblLook w:firstColumn="1" w:firstRow="1" w:lastColumn="0" w:lastRow="0" w:noHBand="0" w:noVBand="1" w:val="04A0"/>
+      </w:tblPr>
+      <w:tblGrid>
+        <w:gridCol w:w="3137"/>
+        <w:gridCol w:w="3137"/>
+        <w:gridCol w:w="3137"/>
+      </w:tblGrid>
+      <w:tr>
+        <w:tc>
+          <w:tcPr>
+            <w:tcW w:type="dxa" w:w="3137"/>
+            <w:shd w:val="clear" w:color="auto" w:fill="0B5C5A"/>
+          </w:tcPr>
+          <w:p>
+            <w:pPr>
+              <w:spacing w:after="0"/>
+            </w:pPr>
+            <w:r>
+              <w:rPr>
+                <w:rFonts w:ascii="맑은 고딕" w:hAnsi="맑은 고딕" w:eastAsia="맑은 고딕"/>
+                <w:b/>
+                <w:color w:val="FFFFFF"/>
+                <w:sz w:val="19"/>
+              </w:rPr>
+              <w:t>종류</w:t>
+            </w:r>
+          </w:p>
+        </w:tc>
+        <w:tc>
+          <w:tcPr>
+            <w:tcW w:type="dxa" w:w="3137"/>
+            <w:shd w:val="clear" w:color="auto" w:fill="0B5C5A"/>
+          </w:tcPr>
+          <w:p>
+            <w:pPr>
+              <w:spacing w:after="0"/>
+            </w:pPr>
+            <w:r>
+              <w:rPr>
+                <w:rFonts w:ascii="맑은 고딕" w:hAnsi="맑은 고딕" w:eastAsia="맑은 고딕"/>
+                <w:b/>
+                <w:color w:val="FFFFFF"/>
+                <w:sz w:val="19"/>
+              </w:rPr>
+              <w:t>APA</w:t>
+            </w:r>
+          </w:p>
+        </w:tc>
+        <w:tc>
+          <w:tcPr>
+            <w:tcW w:type="dxa" w:w="3137"/>
+            <w:shd w:val="clear" w:color="auto" w:fill="0B5C5A"/>
+          </w:tcPr>
+          <w:p>
+            <w:pPr>
+              <w:spacing w:after="0"/>
+            </w:pPr>
+            <w:r>
+              <w:rPr>
+                <w:rFonts w:ascii="맑은 고딕" w:hAnsi="맑은 고딕" w:eastAsia="맑은 고딕"/>
+                <w:b/>
+                <w:color w:val="FFFFFF"/>
+                <w:sz w:val="19"/>
+              </w:rPr>
+              <w:t>IEEE</w:t>
+            </w:r>
+          </w:p>
+        </w:tc>
+      </w:tr>
+      <w:tr>
+        <w:tc>
+          <w:tcPr>
+            <w:tcW w:type="dxa" w:w="3137"/>
+          </w:tcPr>
+          <w:p>
+            <w:pPr>
+              <w:spacing w:after="0"/>
+            </w:pPr>
+            <w:r>
+              <w:rPr>
+                <w:rFonts w:ascii="맑은 고딕" w:hAnsi="맑은 고딕" w:eastAsia="맑은 고딕"/>
+                <w:b w:val="0"/>
+                <w:sz w:val="19"/>
+              </w:rPr>
+              <w:t>보고서</w:t>
+            </w:r>
+          </w:p>
+        </w:tc>
+        <w:tc>
+          <w:tcPr>
+            <w:tcW w:type="dxa" w:w="3137"/>
+          </w:tcPr>
+          <w:p>
+            <w:pPr>
+              <w:spacing w:after="0"/>
+            </w:pPr>
+            <w:r>
+              <w:rPr>
+                <w:rFonts w:ascii="맑은 고딕" w:hAnsi="맑은 고딕" w:eastAsia="맑은 고딕"/>
+                <w:b w:val="0"/>
+                <w:sz w:val="19"/>
+              </w:rPr>
+              <w:t xml:space="preserve">과학기술정책연구원. (2025). </w:t>
+            </w:r>
+            <w:r>
+              <w:rPr>
+                <w:rFonts w:ascii="맑은 고딕" w:hAnsi="맑은 고딕" w:eastAsia="맑은 고딕"/>
+                <w:b w:val="0"/>
+                <w:i/>
+                <w:sz w:val="19"/>
+              </w:rPr>
+              <w:t>인공지능 시대의 과학기술 인재정책 방향</w:t>
+            </w:r>
+            <w:r>
+              <w:rPr>
+                <w:rFonts w:ascii="맑은 고딕" w:hAnsi="맑은 고딕" w:eastAsia="맑은 고딕"/>
+                <w:b w:val="0"/>
+                <w:sz w:val="19"/>
+              </w:rPr>
+              <w:t xml:space="preserve"> (정책연구 2025-07).</w:t>
+            </w:r>
+          </w:p>
+        </w:tc>
+        <w:tc>
+          <w:tcPr>
+            <w:tcW w:type="dxa" w:w="3137"/>
+          </w:tcPr>
+          <w:p>
+            <w:pPr>
+              <w:spacing w:after="0"/>
+            </w:pPr>
+            <w:r>
+              <w:rPr>
+                <w:rFonts w:ascii="맑은 고딕" w:hAnsi="맑은 고딕" w:eastAsia="맑은 고딕"/>
+                <w:b w:val="0"/>
+                <w:sz w:val="19"/>
+              </w:rPr>
+              <w:t>과학기술정책연구원, "인공지능 시대의 과학기술 인재정책 방향," Rep. 정책연구 2025-07, 2025.</w:t>
+            </w:r>
+          </w:p>
+        </w:tc>
+      </w:tr>
+      <w:tr>
+        <w:tc>
+          <w:tcPr>
+            <w:tcW w:type="dxa" w:w="3137"/>
+            <w:shd w:val="clear" w:color="auto" w:fill="EEF5F4"/>
+          </w:tcPr>
+          <w:p>
+            <w:pPr>
+              <w:spacing w:after="0"/>
+            </w:pPr>
+            <w:r>
+              <w:rPr>
+                <w:rFonts w:ascii="맑은 고딕" w:hAnsi="맑은 고딕" w:eastAsia="맑은 고딕"/>
+                <w:b w:val="0"/>
+                <w:sz w:val="19"/>
+              </w:rPr>
+              <w:t>보도자료</w:t>
+            </w:r>
+          </w:p>
+        </w:tc>
+        <w:tc>
+          <w:tcPr>
+            <w:tcW w:type="dxa" w:w="3137"/>
+            <w:shd w:val="clear" w:color="auto" w:fill="EEF5F4"/>
+          </w:tcPr>
+          <w:p>
+            <w:pPr>
+              <w:spacing w:after="0"/>
+            </w:pPr>
+            <w:r>
+              <w:rPr>
+                <w:rFonts w:ascii="맑은 고딕" w:hAnsi="맑은 고딕" w:eastAsia="맑은 고딕"/>
+                <w:b w:val="0"/>
+                <w:sz w:val="19"/>
+              </w:rPr>
+              <w:t xml:space="preserve">과학기술정보통신부. (2025, December 3). </w:t>
+            </w:r>
+            <w:r>
+              <w:rPr>
+                <w:rFonts w:ascii="맑은 고딕" w:hAnsi="맑은 고딕" w:eastAsia="맑은 고딕"/>
+                <w:b w:val="0"/>
+                <w:i/>
+                <w:sz w:val="19"/>
+              </w:rPr>
+              <w:t>2026년도 과기정통부 예산 23.7조원으로 확정</w:t>
+            </w:r>
+            <w:r>
+              <w:rPr>
+                <w:rFonts w:ascii="맑은 고딕" w:hAnsi="맑은 고딕" w:eastAsia="맑은 고딕"/>
+                <w:b w:val="0"/>
+                <w:sz w:val="19"/>
+              </w:rPr>
+              <w:t>. URL</w:t>
+            </w:r>
+          </w:p>
+        </w:tc>
+        <w:tc>
+          <w:tcPr>
+            <w:tcW w:type="dxa" w:w="3137"/>
+            <w:shd w:val="clear" w:color="auto" w:fill="EEF5F4"/>
+          </w:tcPr>
+          <w:p>
+            <w:pPr>
+              <w:spacing w:after="0"/>
+            </w:pPr>
+            <w:r>
+              <w:rPr>
+                <w:rFonts w:ascii="맑은 고딕" w:hAnsi="맑은 고딕" w:eastAsia="맑은 고딕"/>
+                <w:b w:val="0"/>
+                <w:sz w:val="19"/>
+              </w:rPr>
+              <w:t>과학기술정보통신부, "2026년도 과기정통부 예산…," Dec. 3, 2025. Accessed: …. [Online]. Available: URL</w:t>
+            </w:r>
+          </w:p>
+        </w:tc>
+      </w:tr>
+      <w:tr>
+        <w:tc>
+          <w:tcPr>
+            <w:tcW w:type="dxa" w:w="3137"/>
+          </w:tcPr>
+          <w:p>
+            <w:pPr>
+              <w:spacing w:after="0"/>
+            </w:pPr>
+            <w:r>
+              <w:rPr>
+                <w:rFonts w:ascii="맑은 고딕" w:hAnsi="맑은 고딕" w:eastAsia="맑은 고딕"/>
+                <w:b w:val="0"/>
+                <w:sz w:val="19"/>
+              </w:rPr>
+              <w:t>DOI 있는 보고서</w:t>
+            </w:r>
+          </w:p>
+        </w:tc>
+        <w:tc>
+          <w:tcPr>
+            <w:tcW w:type="dxa" w:w="3137"/>
+          </w:tcPr>
+          <w:p>
+            <w:pPr>
+              <w:spacing w:after="0"/>
+            </w:pPr>
+            <w:r>
+              <w:rPr>
+                <w:rFonts w:ascii="맑은 고딕" w:hAnsi="맑은 고딕" w:eastAsia="맑은 고딕"/>
+                <w:b w:val="0"/>
+                <w:sz w:val="19"/>
+              </w:rPr>
+              <w:t xml:space="preserve">Tabassi, E. (2023). </w:t>
+            </w:r>
+            <w:r>
+              <w:rPr>
+                <w:rFonts w:ascii="맑은 고딕" w:hAnsi="맑은 고딕" w:eastAsia="맑은 고딕"/>
+                <w:b w:val="0"/>
+                <w:i/>
+                <w:sz w:val="19"/>
+              </w:rPr>
+              <w:t>Artificial Intelligence Risk Management Framework (AI RMF 1.0)</w:t>
+            </w:r>
+            <w:r>
+              <w:rPr>
+                <w:rFonts w:ascii="맑은 고딕" w:hAnsi="맑은 고딕" w:eastAsia="맑은 고딕"/>
+                <w:b w:val="0"/>
+                <w:sz w:val="19"/>
+              </w:rPr>
+              <w:t>. National Institute of Standards and Technology (U.S.). https://doi.org/10.6028/nist.ai.100-1</w:t>
+            </w:r>
+          </w:p>
+        </w:tc>
+        <w:tc>
+          <w:tcPr>
+            <w:tcW w:type="dxa" w:w="3137"/>
+          </w:tcPr>
+          <w:p>
+            <w:pPr>
+              <w:spacing w:after="0"/>
+            </w:pPr>
+            <w:r>
+              <w:rPr>
+                <w:rFonts w:ascii="맑은 고딕" w:hAnsi="맑은 고딕" w:eastAsia="맑은 고딕"/>
+                <w:b w:val="0"/>
+                <w:sz w:val="19"/>
+              </w:rPr>
+              <w:t>E. Tabassi, "Artificial Intelligence Risk Management Framework…," National Institute of Standards and Technology (U.S.), 2023, doi: 10.6028/nist.ai.100-1.</w:t>
+            </w:r>
+          </w:p>
+        </w:tc>
+      </w:tr>
+    </w:tbl>
+    <w:p/>
+    <w:p>
+      <w:pPr>
+        <w:ind w:left="227"/>
+        <w:shd w:val="clear" w:color="auto" w:fill="EEF5F4"/>
+      </w:pPr>
+      <w:r>
+        <w:rPr>
+          <w:rFonts w:ascii="맑은 고딕" w:hAnsi="맑은 고딕" w:eastAsia="맑은 고딕"/>
+          <w:b w:val="0"/>
+          <w:sz w:val="20"/>
+        </w:rPr>
+        <w:t>보고서 PDF가 로그인 뒤에 있거나 직접 링크가 없으면 Claude가 내려받아 달라고 요청합니다. 받은 파일 경로를 알려 주면 됩니다.</w:t>
+      </w:r>
+    </w:p>
+    <w:p>
+      <w:pPr>
+        <w:pStyle w:val="Heading2"/>
+      </w:pPr>
+      <w:r>
+        <w:t>6. 저장한 논문 찾고 보기</w:t>
       </w:r>
     </w:p>
     <w:p>
@@ -1101,7 +1775,7 @@
         <w:pStyle w:val="Heading2"/>
       </w:pPr>
       <w:r>
-        <w:t>6. 글쓰기와 자동 인용</w:t>
+        <w:t>7. 글쓰기와 자동 인용</w:t>
       </w:r>
     </w:p>
     <w:p>
@@ -1673,7 +2347,7 @@
         <w:pStyle w:val="Heading2"/>
       </w:pPr>
       <w:r>
-        <w:t>7. 잘 쓰는 요령</w:t>
+        <w:t>8. 잘 쓰는 요령</w:t>
       </w:r>
     </w:p>
     <w:p>
@@ -1757,7 +2431,7 @@
         <w:pStyle w:val="Heading2"/>
       </w:pPr>
       <w:r>
-        <w:t>8. 자주 묻는 질문</w:t>
+        <w:t>9. 자주 묻는 질문</w:t>
       </w:r>
     </w:p>
     <w:p>
@@ -1933,7 +2607,7 @@
                 <w:color w:val="8A2B2B"/>
                 <w:sz w:val="17"/>
               </w:rPr>
-              <w:t>paperlib.py add &lt;DOI·arXiv·PDF&gt; [--no-pdf] [--key &lt;키&gt;]</w:t>
+              <w:t>paperlib.py add &lt;DOI·arXiv·PDF·웹 URL&gt; [--no-pdf] [--key &lt;키&gt;]</w:t>
             </w:r>
           </w:p>
         </w:tc>
@@ -1951,7 +2625,85 @@
                 <w:b w:val="0"/>
                 <w:sz w:val="19"/>
               </w:rPr>
-              <w:t>논문 등록, 받은 PDF 붙이기</w:t>
+              <w:t>논문·보고서·웹페이지 등록, 받은 PDF 붙이기</w:t>
+            </w:r>
+          </w:p>
+        </w:tc>
+      </w:tr>
+      <w:tr>
+        <w:tc>
+          <w:tcPr>
+            <w:tcW w:type="dxa" w:w="4706"/>
+            <w:shd w:val="clear" w:color="auto" w:fill="EEF5F4"/>
+          </w:tcPr>
+          <w:p>
+            <w:pPr>
+              <w:spacing w:after="0"/>
+            </w:pPr>
+            <w:r>
+              <w:rPr>
+                <w:rFonts w:ascii="Consolas" w:hAnsi="Consolas" w:eastAsia="맑은 고딕"/>
+                <w:color w:val="8A2B2B"/>
+                <w:sz w:val="17"/>
+              </w:rPr>
+              <w:t>paperlib.py set &lt;키&gt; 필드=값 …</w:t>
+            </w:r>
+          </w:p>
+        </w:tc>
+        <w:tc>
+          <w:tcPr>
+            <w:tcW w:type="dxa" w:w="4706"/>
+            <w:shd w:val="clear" w:color="auto" w:fill="EEF5F4"/>
+          </w:tcPr>
+          <w:p>
+            <w:pPr>
+              <w:spacing w:after="0"/>
+            </w:pPr>
+            <w:r>
+              <w:rPr>
+                <w:rFonts w:ascii="맑은 고딕" w:hAnsi="맑은 고딕" w:eastAsia="맑은 고딕"/>
+                <w:b w:val="0"/>
+                <w:sz w:val="19"/>
+              </w:rPr>
+              <w:t>서지 보완 (authors, year, publisher, number, url, date, type 등)</w:t>
+            </w:r>
+          </w:p>
+        </w:tc>
+      </w:tr>
+      <w:tr>
+        <w:tc>
+          <w:tcPr>
+            <w:tcW w:type="dxa" w:w="4706"/>
+          </w:tcPr>
+          <w:p>
+            <w:pPr>
+              <w:spacing w:after="0"/>
+            </w:pPr>
+            <w:r>
+              <w:rPr>
+                <w:rFonts w:ascii="Consolas" w:hAnsi="Consolas" w:eastAsia="맑은 고딕"/>
+                <w:color w:val="8A2B2B"/>
+                <w:sz w:val="17"/>
+              </w:rPr>
+              <w:t>paperlib.py rename &lt;키&gt; &lt;새 키&gt;</w:t>
+            </w:r>
+          </w:p>
+        </w:tc>
+        <w:tc>
+          <w:tcPr>
+            <w:tcW w:type="dxa" w:w="4706"/>
+          </w:tcPr>
+          <w:p>
+            <w:pPr>
+              <w:spacing w:after="0"/>
+            </w:pPr>
+            <w:r>
+              <w:rPr>
+                <w:rFonts w:ascii="맑은 고딕" w:hAnsi="맑은 고딕" w:eastAsia="맑은 고딕"/>
+                <w:b w:val="0"/>
+                <w:sz w:val="19"/>
+              </w:rPr>
+              <w:t>인용 키 바꾸기</w:t>
             </w:r>
           </w:p>
         </w:tc>

</xml_diff>

<commit_message>
Make IEEE numbered citations the default
- cite defaults to IEEE: [1] in the text, references numbered in
  order of first appearance; APA only when asked
- SKILL.md, README and usage guide (4 formats) use "참고문헌 달아줘"
  for the default and show APA as the alternative

Co-Authored-By: Claude Opus 5.5 <noreply@anthropic.com>
</commit_message>
<xml_diff>
--- a/docs/paper-summary_사용가이드.docx
+++ b/docs/paper-summary_사용가이드.docx
@@ -371,7 +371,7 @@
                 <w:color w:val="8A2B2B"/>
                 <w:sz w:val="17"/>
               </w:rPr>
-              <w:t>라이브러리의 HRV 논문들로 연구 배경 써주고 참고문헌 APA로 달아줘</w:t>
+              <w:t>라이브러리의 HRV 논문들로 연구 배경 써주고 참고문헌 달아줘</w:t>
             </w:r>
           </w:p>
         </w:tc>
@@ -411,7 +411,7 @@
                 <w:color w:val="8A2B2B"/>
                 <w:sz w:val="17"/>
               </w:rPr>
-              <w:t>draft.md 참고문헌 IEEE로 달아줘</w:t>
+              <w:t>draft.md 참고문헌 달아줘</w:t>
             </w:r>
           </w:p>
         </w:tc>
@@ -1797,7 +1797,7 @@
           <w:rFonts w:ascii="Consolas" w:hAnsi="Consolas" w:eastAsia="맑은 고딕"/>
           <w:sz w:val="18"/>
         </w:rPr>
-        <w:t>라이브러리의 HRV 논문들로 연구 배경 한 단락 써주고 참고문헌 APA로 달아줘</w:t>
+        <w:t>라이브러리의 HRV 논문들로 연구 배경 한 단락 써주고 참고문헌 달아줘</w:t>
       </w:r>
     </w:p>
     <w:p>
@@ -1908,7 +1908,7 @@
           <w:rFonts w:ascii="Consolas" w:hAnsi="Consolas" w:eastAsia="맑은 고딕"/>
           <w:sz w:val="18"/>
         </w:rPr>
-        <w:t>draft.md 참고문헌 APA로 달아줘</w:t>
+        <w:t>draft.md 참고문헌 달아줘</w:t>
       </w:r>
     </w:p>
     <w:p>
@@ -1922,7 +1922,7 @@
           <w:rFonts w:ascii="Consolas" w:hAnsi="Consolas" w:eastAsia="맑은 고딕"/>
           <w:sz w:val="18"/>
         </w:rPr>
-        <w:t>draft.md IEEE 형식으로 바꿔줘</w:t>
+        <w:t>draft.md APA 형식으로 바꿔줘</w:t>
       </w:r>
     </w:p>
     <w:p>
@@ -2033,7 +2033,7 @@
                 <w:color w:val="FFFFFF"/>
                 <w:sz w:val="19"/>
               </w:rPr>
-              <w:t>APA로 달면</w:t>
+              <w:t>기본 (IEEE 번호식)</w:t>
             </w:r>
           </w:p>
         </w:tc>
@@ -2053,7 +2053,7 @@
                 <w:color w:val="FFFFFF"/>
                 <w:sz w:val="19"/>
               </w:rPr>
-              <w:t>IEEE로 달면</w:t>
+              <w:t>APA로 요청하면</w:t>
             </w:r>
           </w:p>
         </w:tc>
@@ -2091,7 +2091,7 @@
                 <w:b w:val="0"/>
                 <w:sz w:val="19"/>
               </w:rPr>
-              <w:t>(Pstras et al., 2026)</w:t>
+              <w:t>[1]</w:t>
             </w:r>
           </w:p>
         </w:tc>
@@ -2109,7 +2109,7 @@
                 <w:b w:val="0"/>
                 <w:sz w:val="19"/>
               </w:rPr>
-              <w:t>[1]</w:t>
+              <w:t>(Pstras et al., 2026)</w:t>
             </w:r>
           </w:p>
         </w:tc>
@@ -2149,7 +2149,7 @@
                 <w:b w:val="0"/>
                 <w:sz w:val="19"/>
               </w:rPr>
-              <w:t>(Pstras et al., 2026, p. 7)</w:t>
+              <w:t>[1, p. 7]</w:t>
             </w:r>
           </w:p>
         </w:tc>
@@ -2168,7 +2168,7 @@
                 <w:b w:val="0"/>
                 <w:sz w:val="19"/>
               </w:rPr>
-              <w:t>[1, p. 7]</w:t>
+              <w:t>(Pstras et al., 2026, p. 7)</w:t>
             </w:r>
           </w:p>
         </w:tc>
@@ -2206,7 +2206,7 @@
                 <w:b w:val="0"/>
                 <w:sz w:val="19"/>
               </w:rPr>
-              <w:t>(Pstras et al., 2026; Rouast, 2025)</w:t>
+              <w:t>[1, 2]</w:t>
             </w:r>
           </w:p>
         </w:tc>
@@ -2224,7 +2224,7 @@
                 <w:b w:val="0"/>
                 <w:sz w:val="19"/>
               </w:rPr>
-              <w:t>[1, 2]</w:t>
+              <w:t>(Pstras et al., 2026; Rouast, 2025)</w:t>
             </w:r>
           </w:p>
         </w:tc>
@@ -2238,9 +2238,58 @@
       <w:r>
         <w:rPr>
           <w:rFonts w:ascii="맑은 고딕" w:hAnsi="맑은 고딕" w:eastAsia="맑은 고딕"/>
+          <w:b/>
+        </w:rPr>
+        <w:t>기본은 IEEE 번호식</w:t>
+      </w:r>
+      <w:r>
+        <w:rPr>
+          <w:rFonts w:ascii="맑은 고딕" w:hAnsi="맑은 고딕" w:eastAsia="맑은 고딕"/>
           <w:b w:val="0"/>
         </w:rPr>
-        <w:t>APA는 참고문헌을 저자 알파벳순으로, IEEE는 본문에 처음 나온 순서대로 번호를 매깁니다.</w:t>
+        <w:t xml:space="preserve">입니다. 본문에 </w:t>
+      </w:r>
+      <w:r>
+        <w:rPr>
+          <w:rFonts w:ascii="Consolas" w:hAnsi="Consolas" w:eastAsia="맑은 고딕"/>
+          <w:color w:val="8A2B2B"/>
+          <w:sz w:val="19"/>
+        </w:rPr>
+        <w:t>[1]</w:t>
+      </w:r>
+      <w:r>
+        <w:rPr>
+          <w:rFonts w:ascii="맑은 고딕" w:hAnsi="맑은 고딕" w:eastAsia="맑은 고딕"/>
+          <w:b w:val="0"/>
+        </w:rPr>
+        <w:t xml:space="preserve">, </w:t>
+      </w:r>
+      <w:r>
+        <w:rPr>
+          <w:rFonts w:ascii="Consolas" w:hAnsi="Consolas" w:eastAsia="맑은 고딕"/>
+          <w:color w:val="8A2B2B"/>
+          <w:sz w:val="19"/>
+        </w:rPr>
+        <w:t>[1, p. 7]</w:t>
+      </w:r>
+      <w:r>
+        <w:rPr>
+          <w:rFonts w:ascii="맑은 고딕" w:hAnsi="맑은 고딕" w:eastAsia="맑은 고딕"/>
+          <w:b w:val="0"/>
+        </w:rPr>
+        <w:t>처럼 넣고, 끝의 참고문헌은 본문에 처음 나온 순서대로 번호를 매깁니다.</w:t>
+      </w:r>
+    </w:p>
+    <w:p>
+      <w:pPr>
+        <w:pStyle w:val="ListBullet"/>
+      </w:pPr>
+      <w:r>
+        <w:rPr>
+          <w:rFonts w:ascii="맑은 고딕" w:hAnsi="맑은 고딕" w:eastAsia="맑은 고딕"/>
+          <w:b w:val="0"/>
+        </w:rPr>
+        <w:t>APA가 필요하면 "APA로"라고 말하면 됩니다(본문은 저자-연도, 참고문헌은 알파벳순).</w:t>
       </w:r>
     </w:p>
     <w:p>
@@ -2818,7 +2867,7 @@
                 <w:color w:val="8A2B2B"/>
                 <w:sz w:val="17"/>
               </w:rPr>
-              <w:t>paperlib.py cite &lt;원고.md&gt; [--style apa|ieee] [--table]</w:t>
+              <w:t>paperlib.py cite &lt;원고.md&gt; [--style ieee|apa] [--table]</w:t>
             </w:r>
           </w:p>
         </w:tc>
@@ -2837,7 +2886,7 @@
                 <w:b w:val="0"/>
                 <w:sz w:val="19"/>
               </w:rPr>
-              <w:t>인용 키 → 본문 인용 + 참고문헌</w:t>
+              <w:t>인용 키 → 본문 [1] + 참고문헌 (기본 IEEE)</w:t>
             </w:r>
           </w:p>
         </w:tc>

</xml_diff>